<commit_message>
docs(marketing): 补全图片资产——docx 从 3 张增至 7 张,markdown 从 2 张增至 5 张
用户指出 md 和 docx 都没充分利用已有的图片资产。补上:

- **架构图**(loop-to-dsh-planes):SVG 转 PNG(Chrome headless 2400×1600),
  插在第 7 节(架构)——读者能看到 ClearAI 在 DSH 组合面上的位置。
- **面板截图** ×3:
  - facts.png → 第 4 节(本体的形态)——展示本体格的图带+货架+命题
  - worldlines.png → 第 5 节(认识论)——展示世界树的计划拓扑与闸门
  - deliverables.png → 第 10 节(上手之前)——展示产物格的声明与实际分开
- **品牌 logo**:封面加 logo-lockup

docx: 7 张图 · 225 段 · 验证通过。
markdown: 5 张图(品牌 logo 和封面主图在 docx 封面里,md 正文里不需要重复)。
</commit_message>
<xml_diff>
--- a/docs/marketing/clearai-dsh-知乎稿.docx
+++ b/docs/marketing/clearai-dsh-知乎稿.docx
@@ -117,1860 +117,15 @@
     </w:p>
     <w:p>
       <w:pPr>
-        <w:spacing w:after="100" w:before="200"/>
-        <w:jc w:val="center"/>
-      </w:pPr>
-      <w:r>
-        <w:rPr>
-          <w:rFonts w:ascii="PingFang SC" w:cs="PingFang SC" w:eastAsia="PingFang SC" w:hAnsi="PingFang SC"/>
-          <w:color w:val="6B6862"/>
-          <w:sz w:val="20"/>
-          <w:szCs w:val="20"/>
-        </w:rPr>
-        <w:t xml:space="preserve">15 套件 1372 条断言 · 29 个意图工具 · 6694 行内核 · Apache-2.0</w:t>
-      </w:r>
-    </w:p>
-    <w:p>
-      <w:pPr>
-        <w:jc w:val="center"/>
-      </w:pPr>
-      <w:r>
-        <w:rPr>
-          <w:rFonts w:ascii="PingFang SC" w:cs="PingFang SC" w:eastAsia="PingFang SC" w:hAnsi="PingFang SC"/>
-          <w:b/>
-          <w:bCs/>
-          <w:color w:val="2E75B6"/>
-          <w:sz w:val="22"/>
-          <w:szCs w:val="22"/>
-        </w:rPr>
-        <w:t xml:space="preserve">npx clearai-dsh install</w:t>
-      </w:r>
-    </w:p>
-    <w:p>
-      <w:r>
-        <w:br w:type="page"/>
-      </w:r>
-    </w:p>
-    <w:p>
-      <w:pPr>
-        <w:pStyle w:val="Heading2"/>
-        <w:pBdr>
-          <w:bottom w:val="single" w:color="2E75B6" w:sz="4" w:space="4"/>
-        </w:pBdr>
-        <w:spacing w:after="200" w:before="400"/>
-      </w:pPr>
-      <w:r>
-        <w:rPr>
-          <w:rFonts w:ascii="PingFang SC" w:cs="PingFang SC" w:eastAsia="PingFang SC" w:hAnsi="PingFang SC"/>
-          <w:b/>
-          <w:bCs/>
-          <w:color w:val="1C1A18"/>
-          <w:sz w:val="30"/>
-          <w:szCs w:val="30"/>
-        </w:rPr>
-        <w:t xml:space="preserve">1、我们在解决什么问题</w:t>
-      </w:r>
-    </w:p>
-    <w:p>
-      <w:pPr>
-        <w:spacing w:after="160" w:line="340"/>
-      </w:pPr>
-      <w:r>
-        <w:rPr>
-          <w:rFonts w:ascii="PingFang SC" w:cs="PingFang SC" w:eastAsia="PingFang SC" w:hAnsi="PingFang SC"/>
-          <w:color w:val="1C1A18"/>
-          <w:sz w:val="22"/>
-          <w:szCs w:val="22"/>
-        </w:rPr>
-        <w:t xml:space="preserve">用 AI Agent 做过正经研究的人大概都撞过这堵墙。</w:t>
-      </w:r>
-    </w:p>
-    <w:p>
-      <w:pPr>
-        <w:spacing w:after="160" w:line="340"/>
-      </w:pPr>
-      <w:r>
-        <w:rPr>
-          <w:rFonts w:ascii="PingFang SC" w:cs="PingFang SC" w:eastAsia="PingFang SC" w:hAnsi="PingFang SC"/>
-          <w:color w:val="1C1A18"/>
-          <w:sz w:val="22"/>
-          <w:szCs w:val="22"/>
-        </w:rPr>
-        <w:t xml:space="preserve">你让模型调研一个技术选型，它给你一份漂亮的分析。有结构、有数据、有结论。你读完觉得有道理，准备拿去汇报。</w:t>
-      </w:r>
-    </w:p>
-    <w:p>
-      <w:pPr>
-        <w:spacing w:after="160" w:line="340"/>
-      </w:pPr>
-      <w:r>
-        <w:rPr>
-          <w:rFonts w:ascii="PingFang SC" w:cs="PingFang SC" w:eastAsia="PingFang SC" w:hAnsi="PingFang SC"/>
-          <w:color w:val="1C1A18"/>
-          <w:sz w:val="22"/>
-          <w:szCs w:val="22"/>
-        </w:rPr>
-        <w:t xml:space="preserve">然后有人问：</w:t>
-      </w:r>
-      <w:r>
-        <w:rPr>
-          <w:rFonts w:ascii="PingFang SC" w:cs="PingFang SC" w:eastAsia="PingFang SC" w:hAnsi="PingFang SC"/>
-          <w:b/>
-          <w:bCs/>
-          <w:color w:val="1C1A18"/>
-          <w:sz w:val="22"/>
-          <w:szCs w:val="22"/>
-        </w:rPr>
-        <w:t xml:space="preserve">"这个结论怎么验证的？证据在哪？"</w:t>
-      </w:r>
-    </w:p>
-    <w:p>
-      <w:pPr>
-        <w:spacing w:after="160" w:line="340"/>
-      </w:pPr>
-      <w:r>
-        <w:rPr>
-          <w:rFonts w:ascii="PingFang SC" w:cs="PingFang SC" w:eastAsia="PingFang SC" w:hAnsi="PingFang SC"/>
-          <w:color w:val="1C1A18"/>
-          <w:sz w:val="22"/>
-          <w:szCs w:val="22"/>
-        </w:rPr>
-        <w:t xml:space="preserve">你翻聊天记录。证据散落在十几轮对话里，有的在工具输出里，有的在模型自己的推理链里，有的根本没有。你甚至不确定模型是推理出来的还是编出来的。</w:t>
-      </w:r>
-    </w:p>
-    <w:p>
-      <w:pPr>
-        <w:spacing w:after="160" w:line="340"/>
-      </w:pPr>
-      <w:r>
-        <w:rPr>
-          <w:rFonts w:ascii="PingFang SC" w:cs="PingFang SC" w:eastAsia="PingFang SC" w:hAnsi="PingFang SC"/>
-          <w:color w:val="1C1A18"/>
-          <w:sz w:val="22"/>
-          <w:szCs w:val="22"/>
-        </w:rPr>
-        <w:t xml:space="preserve">这件事的本质：</w:t>
-      </w:r>
-      <w:r>
-        <w:rPr>
-          <w:rFonts w:ascii="PingFang SC" w:cs="PingFang SC" w:eastAsia="PingFang SC" w:hAnsi="PingFang SC"/>
-          <w:b/>
-          <w:bCs/>
-          <w:color w:val="1C1A18"/>
-          <w:sz w:val="22"/>
-          <w:szCs w:val="22"/>
-        </w:rPr>
-        <w:t xml:space="preserve">Agent 架构里没有一个地方存放"这个结论凭什么成立"。</w:t>
-      </w:r>
-      <w:r>
-        <w:rPr>
-          <w:rFonts w:ascii="PingFang SC" w:cs="PingFang SC" w:eastAsia="PingFang SC" w:hAnsi="PingFang SC"/>
-          <w:color w:val="1C1A18"/>
-          <w:sz w:val="22"/>
-          <w:szCs w:val="22"/>
-        </w:rPr>
-        <w:t xml:space="preserve">聊天记录不存这个，向量数据库不存这个，LangGraph 的 state graph 也不存这个。</w:t>
-      </w:r>
-    </w:p>
-    <w:p>
-      <w:pPr>
-        <w:spacing w:after="160" w:line="340"/>
-      </w:pPr>
-      <w:r>
-        <w:rPr>
-          <w:rFonts w:ascii="PingFang SC" w:cs="PingFang SC" w:eastAsia="PingFang SC" w:hAnsi="PingFang SC"/>
-          <w:color w:val="1C1A18"/>
-          <w:sz w:val="22"/>
-          <w:szCs w:val="22"/>
-        </w:rPr>
-        <w:t xml:space="preserve">同时，你希望研究产出能</w:t>
-      </w:r>
-      <w:r>
-        <w:rPr>
-          <w:rFonts w:ascii="PingFang SC" w:cs="PingFang SC" w:eastAsia="PingFang SC" w:hAnsi="PingFang SC"/>
-          <w:b/>
-          <w:bCs/>
-          <w:color w:val="1C1A18"/>
-          <w:sz w:val="22"/>
-          <w:szCs w:val="22"/>
-        </w:rPr>
-        <w:t xml:space="preserve">积累</w:t>
-      </w:r>
-      <w:r>
-        <w:rPr>
-          <w:rFonts w:ascii="PingFang SC" w:cs="PingFang SC" w:eastAsia="PingFang SC" w:hAnsi="PingFang SC"/>
-          <w:color w:val="1C1A18"/>
-          <w:sz w:val="22"/>
-          <w:szCs w:val="22"/>
-        </w:rPr>
-        <w:t xml:space="preserve">——今天做完的调研，明天换一个人还能接着用。积累需要一个结构化的形态。</w:t>
-      </w:r>
-    </w:p>
-    <w:p>
-      <w:pPr>
-        <w:spacing w:after="160" w:line="340"/>
-      </w:pPr>
-      <w:r>
-        <w:rPr>
-          <w:rFonts w:ascii="PingFang SC" w:cs="PingFang SC" w:eastAsia="PingFang SC" w:hAnsi="PingFang SC"/>
-          <w:color w:val="1C1A18"/>
-          <w:sz w:val="22"/>
-          <w:szCs w:val="22"/>
-        </w:rPr>
-        <w:t xml:space="preserve">我们的判断：这个形态是</w:t>
-      </w:r>
-      <w:r>
-        <w:rPr>
-          <w:rFonts w:ascii="PingFang SC" w:cs="PingFang SC" w:eastAsia="PingFang SC" w:hAnsi="PingFang SC"/>
-          <w:b/>
-          <w:bCs/>
-          <w:color w:val="1C1A18"/>
-          <w:sz w:val="22"/>
-          <w:szCs w:val="22"/>
-        </w:rPr>
-        <w:t xml:space="preserve">领域本体</w:t>
-      </w:r>
-      <w:r>
-        <w:rPr>
-          <w:rFonts w:ascii="PingFang SC" w:cs="PingFang SC" w:eastAsia="PingFang SC" w:hAnsi="PingFang SC"/>
-          <w:color w:val="1C1A18"/>
-          <w:sz w:val="22"/>
-          <w:szCs w:val="22"/>
-        </w:rPr>
-        <w:t xml:space="preserve">（domain ontology），而让本体里的每条边都可信的那套工艺是</w:t>
-      </w:r>
-      <w:r>
-        <w:rPr>
-          <w:rFonts w:ascii="PingFang SC" w:cs="PingFang SC" w:eastAsia="PingFang SC" w:hAnsi="PingFang SC"/>
-          <w:b/>
-          <w:bCs/>
-          <w:color w:val="1C1A18"/>
-          <w:sz w:val="22"/>
-          <w:szCs w:val="22"/>
-        </w:rPr>
-        <w:t xml:space="preserve">认识论循环</w:t>
-      </w:r>
-      <w:r>
-        <w:rPr>
-          <w:rFonts w:ascii="PingFang SC" w:cs="PingFang SC" w:eastAsia="PingFang SC" w:hAnsi="PingFang SC"/>
-          <w:color w:val="1C1A18"/>
-          <w:sz w:val="22"/>
-          <w:szCs w:val="22"/>
-        </w:rPr>
-        <w:t xml:space="preserve">（epistemic loop）。ClearAI 把两者做成了一个 DSH 插件：</w:t>
-      </w:r>
-    </w:p>
-    <w:p>
-      <w:pPr>
-        <w:pBdr>
-          <w:left w:val="single" w:color="2E75B6" w:sz="12" w:space="8"/>
-        </w:pBdr>
-        <w:spacing w:after="160" w:before="120"/>
-        <w:ind w:left="480"/>
-      </w:pPr>
-      <w:r>
-        <w:rPr>
-          <w:rFonts w:ascii="PingFang SC" w:cs="PingFang SC" w:eastAsia="PingFang SC" w:hAnsi="PingFang SC"/>
-          <w:b/>
-          <w:bCs/>
-          <w:color w:val="1C1A18"/>
-          <w:sz w:val="22"/>
-          <w:szCs w:val="22"/>
-        </w:rPr>
-        <w:t xml:space="preserve">AI 在你的项目里长出一个活的领域本体，每条边都通过验证循环挣得它的位置。</w:t>
-      </w:r>
-    </w:p>
-    <w:p>
-      <w:pPr>
-        <w:pStyle w:val="Heading2"/>
-        <w:pBdr>
-          <w:bottom w:val="single" w:color="2E75B6" w:sz="4" w:space="4"/>
-        </w:pBdr>
-        <w:spacing w:after="200" w:before="400"/>
-      </w:pPr>
-      <w:r>
-        <w:rPr>
-          <w:rFonts w:ascii="PingFang SC" w:cs="PingFang SC" w:eastAsia="PingFang SC" w:hAnsi="PingFang SC"/>
-          <w:b/>
-          <w:bCs/>
-          <w:color w:val="1C1A18"/>
-          <w:sz w:val="30"/>
-          <w:szCs w:val="30"/>
-        </w:rPr>
-        <w:t xml:space="preserve">2、本体是终点，认识论是到达终点的路</w:t>
-      </w:r>
-    </w:p>
-    <w:p>
-      <w:pPr>
-        <w:spacing w:after="160" w:line="340"/>
-      </w:pPr>
-      <w:r>
-        <w:rPr>
-          <w:rFonts w:ascii="PingFang SC" w:cs="PingFang SC" w:eastAsia="PingFang SC" w:hAnsi="PingFang SC"/>
-          <w:color w:val="1C1A18"/>
-          <w:sz w:val="22"/>
-          <w:szCs w:val="22"/>
-        </w:rPr>
-        <w:t xml:space="preserve">两个词经常被混着用，先把关系说清楚。</w:t>
-      </w:r>
-    </w:p>
-    <w:p>
-      <w:pPr>
-        <w:spacing w:after="160" w:line="340"/>
-      </w:pPr>
-      <w:r>
-        <w:rPr>
-          <w:rFonts w:ascii="PingFang SC" w:cs="PingFang SC" w:eastAsia="PingFang SC" w:hAnsi="PingFang SC"/>
-          <w:b/>
-          <w:bCs/>
-          <w:color w:val="1C1A18"/>
-          <w:sz w:val="22"/>
-          <w:szCs w:val="22"/>
-        </w:rPr>
-        <w:t xml:space="preserve">本体论</w:t>
-      </w:r>
-      <w:r>
-        <w:rPr>
-          <w:rFonts w:ascii="PingFang SC" w:cs="PingFang SC" w:eastAsia="PingFang SC" w:hAnsi="PingFang SC"/>
-          <w:color w:val="1C1A18"/>
-          <w:sz w:val="22"/>
-          <w:szCs w:val="22"/>
-        </w:rPr>
-        <w:t xml:space="preserve">（ontology）回答的问题是：这个世界有哪些类的东西？它们之间有什么关系？在工程语境里，本体的产出是</w:t>
-      </w:r>
-      <w:r>
-        <w:rPr>
-          <w:rFonts w:ascii="PingFang SC" w:cs="PingFang SC" w:eastAsia="PingFang SC" w:hAnsi="PingFang SC"/>
-          <w:b/>
-          <w:bCs/>
-          <w:color w:val="1C1A18"/>
-          <w:sz w:val="22"/>
-          <w:szCs w:val="22"/>
-        </w:rPr>
-        <w:t xml:space="preserve">一组概念、一组谓词、一组实例和它们之间的关系</w:t>
-      </w:r>
-      <w:r>
-        <w:rPr>
-          <w:rFonts w:ascii="PingFang SC" w:cs="PingFang SC" w:eastAsia="PingFang SC" w:hAnsi="PingFang SC"/>
-          <w:color w:val="1C1A18"/>
-          <w:sz w:val="22"/>
-          <w:szCs w:val="22"/>
-        </w:rPr>
-        <w:t xml:space="preserve">——一个结构化的知识库。</w:t>
-      </w:r>
-    </w:p>
-    <w:p>
-      <w:pPr>
-        <w:spacing w:after="160" w:line="340"/>
-      </w:pPr>
-      <w:r>
-        <w:rPr>
-          <w:rFonts w:ascii="PingFang SC" w:cs="PingFang SC" w:eastAsia="PingFang SC" w:hAnsi="PingFang SC"/>
-          <w:b/>
-          <w:bCs/>
-          <w:color w:val="1C1A18"/>
-          <w:sz w:val="22"/>
-          <w:szCs w:val="22"/>
-        </w:rPr>
-        <w:t xml:space="preserve">认识论</w:t>
-      </w:r>
-      <w:r>
-        <w:rPr>
-          <w:rFonts w:ascii="PingFang SC" w:cs="PingFang SC" w:eastAsia="PingFang SC" w:hAnsi="PingFang SC"/>
-          <w:color w:val="1C1A18"/>
-          <w:sz w:val="22"/>
-          <w:szCs w:val="22"/>
-        </w:rPr>
-        <w:t xml:space="preserve">（epistemology）回答的问题是：一个信念凭什么算知识？证据怎么支持结论？在工程语境里，认识论的产出是</w:t>
-      </w:r>
-      <w:r>
-        <w:rPr>
-          <w:rFonts w:ascii="PingFang SC" w:cs="PingFang SC" w:eastAsia="PingFang SC" w:hAnsi="PingFang SC"/>
-          <w:b/>
-          <w:bCs/>
-          <w:color w:val="1C1A18"/>
-          <w:sz w:val="22"/>
-          <w:szCs w:val="22"/>
-        </w:rPr>
-        <w:t xml:space="preserve">一套验证机制</w:t>
-      </w:r>
-      <w:r>
-        <w:rPr>
-          <w:rFonts w:ascii="PingFang SC" w:cs="PingFang SC" w:eastAsia="PingFang SC" w:hAnsi="PingFang SC"/>
-          <w:color w:val="1C1A18"/>
-          <w:sz w:val="22"/>
-          <w:szCs w:val="22"/>
-        </w:rPr>
-        <w:t xml:space="preserve">——判据怎么登记、证据怎么分级、结论怎么裁决。</w:t>
-      </w:r>
-    </w:p>
-    <w:p>
-      <w:pPr>
-        <w:spacing w:after="160" w:line="340"/>
-      </w:pPr>
-      <w:r>
-        <w:rPr>
-          <w:rFonts w:ascii="PingFang SC" w:cs="PingFang SC" w:eastAsia="PingFang SC" w:hAnsi="PingFang SC"/>
-          <w:color w:val="1C1A18"/>
-          <w:sz w:val="22"/>
-          <w:szCs w:val="22"/>
-        </w:rPr>
-        <w:t xml:space="preserve">两者的关系用一个比喻：</w:t>
-      </w:r>
-    </w:p>
-    <w:p>
-      <w:pPr>
-        <w:pStyle w:val="ListParagraph"/>
-        <w:numPr>
-          <w:ilvl w:val="0"/>
-          <w:numId w:val="1"/>
-        </w:numPr>
-        <w:spacing w:after="100" w:line="320"/>
-      </w:pPr>
-      <w:r>
-        <w:rPr>
-          <w:rFonts w:ascii="PingFang SC" w:cs="PingFang SC" w:eastAsia="PingFang SC" w:hAnsi="PingFang SC"/>
-          <w:b/>
-          <w:bCs/>
-          <w:color w:val="1C1A18"/>
-          <w:sz w:val="22"/>
-          <w:szCs w:val="22"/>
-        </w:rPr>
-        <w:t xml:space="preserve">本体是房子</w:t>
-      </w:r>
-      <w:r>
-        <w:rPr>
-          <w:rFonts w:ascii="PingFang SC" w:cs="PingFang SC" w:eastAsia="PingFang SC" w:hAnsi="PingFang SC"/>
-          <w:color w:val="1C1A18"/>
-          <w:sz w:val="22"/>
-          <w:szCs w:val="22"/>
-        </w:rPr>
-        <w:t xml:space="preserve">——你要住的地方，最终交付的东西。</w:t>
-      </w:r>
-    </w:p>
-    <w:p>
-      <w:pPr>
-        <w:pStyle w:val="ListParagraph"/>
-        <w:numPr>
-          <w:ilvl w:val="0"/>
-          <w:numId w:val="1"/>
-        </w:numPr>
-        <w:spacing w:after="100" w:line="320"/>
-      </w:pPr>
-      <w:r>
-        <w:rPr>
-          <w:rFonts w:ascii="PingFang SC" w:cs="PingFang SC" w:eastAsia="PingFang SC" w:hAnsi="PingFang SC"/>
-          <w:b/>
-          <w:bCs/>
-          <w:color w:val="1C1A18"/>
-          <w:sz w:val="22"/>
-          <w:szCs w:val="22"/>
-        </w:rPr>
-        <w:t xml:space="preserve">认识论是施工规范</w:t>
-      </w:r>
-      <w:r>
-        <w:rPr>
-          <w:rFonts w:ascii="PingFang SC" w:cs="PingFang SC" w:eastAsia="PingFang SC" w:hAnsi="PingFang SC"/>
-          <w:color w:val="1C1A18"/>
-          <w:sz w:val="22"/>
-          <w:szCs w:val="22"/>
-        </w:rPr>
-        <w:t xml:space="preserve">——地基怎么打、钢筋怎么焊、验收怎么做。</w:t>
-      </w:r>
-    </w:p>
-    <w:p>
-      <w:pPr>
-        <w:spacing w:after="160" w:line="340"/>
-      </w:pPr>
-      <w:r>
-        <w:rPr>
-          <w:rFonts w:ascii="PingFang SC" w:cs="PingFang SC" w:eastAsia="PingFang SC" w:hAnsi="PingFang SC"/>
-          <w:color w:val="1C1A18"/>
-          <w:sz w:val="22"/>
-          <w:szCs w:val="22"/>
-        </w:rPr>
-        <w:t xml:space="preserve">没有施工规范的房子也能盖起来，看起来像模像样。但你敢住吗？</w:t>
-      </w:r>
-    </w:p>
-    <w:p>
-      <w:pPr>
-        <w:spacing w:after="160" w:line="340"/>
-      </w:pPr>
-      <w:r>
-        <w:rPr>
-          <w:rFonts w:ascii="PingFang SC" w:cs="PingFang SC" w:eastAsia="PingFang SC" w:hAnsi="PingFang SC"/>
-          <w:color w:val="1C1A18"/>
-          <w:sz w:val="22"/>
-          <w:szCs w:val="22"/>
-        </w:rPr>
-        <w:t xml:space="preserve">市面上绝大多数"AI + 知识图谱"的做法是：让 LLM 从文本里抽取实体和关系，直接画到图上。这相当于</w:t>
-      </w:r>
-      <w:r>
-        <w:rPr>
-          <w:rFonts w:ascii="PingFang SC" w:cs="PingFang SC" w:eastAsia="PingFang SC" w:hAnsi="PingFang SC"/>
-          <w:b/>
-          <w:bCs/>
-          <w:color w:val="1C1A18"/>
-          <w:sz w:val="22"/>
-          <w:szCs w:val="22"/>
-        </w:rPr>
-        <w:t xml:space="preserve">让一个没有资质的承包商凭感觉盖房子</w:t>
-      </w:r>
-      <w:r>
-        <w:rPr>
-          <w:rFonts w:ascii="PingFang SC" w:cs="PingFang SC" w:eastAsia="PingFang SC" w:hAnsi="PingFang SC"/>
-          <w:color w:val="1C1A18"/>
-          <w:sz w:val="22"/>
-          <w:szCs w:val="22"/>
-        </w:rPr>
-        <w:t xml:space="preserve">。速度很快，外观很漂亮，但你不知道墙里有没有钢筋。</w:t>
-      </w:r>
-    </w:p>
-    <w:p>
-      <w:pPr>
-        <w:spacing w:after="160" w:line="340"/>
-      </w:pPr>
-      <w:r>
-        <w:rPr>
-          <w:rFonts w:ascii="PingFang SC" w:cs="PingFang SC" w:eastAsia="PingFang SC" w:hAnsi="PingFang SC"/>
-          <w:color w:val="1C1A18"/>
-          <w:sz w:val="22"/>
-          <w:szCs w:val="22"/>
-        </w:rPr>
-        <w:t xml:space="preserve">ClearAI 的做法：每一块砖（每一条断言）都要过验收（验证循环），验收记录（证据链）跟着砖走，房子盖完时每面墙都可以追溯到验收单。</w:t>
-      </w:r>
-    </w:p>
-    <w:p>
-      <w:pPr>
-        <w:spacing w:after="160" w:line="340"/>
-      </w:pPr>
-      <w:r>
-        <w:rPr>
-          <w:rFonts w:ascii="PingFang SC" w:cs="PingFang SC" w:eastAsia="PingFang SC" w:hAnsi="PingFang SC"/>
-          <w:b/>
-          <w:bCs/>
-          <w:color w:val="1C1A18"/>
-          <w:sz w:val="22"/>
-          <w:szCs w:val="22"/>
-        </w:rPr>
-        <w:t xml:space="preserve">本体是交付物，认识论是质量体系。缺了质量体系的交付物，不敢用。</w:t>
-      </w:r>
-    </w:p>
-    <w:p>
-      <w:pPr>
-        <w:pStyle w:val="Heading2"/>
-        <w:pBdr>
-          <w:bottom w:val="single" w:color="2E75B6" w:sz="4" w:space="4"/>
-        </w:pBdr>
-        <w:spacing w:after="200" w:before="400"/>
-      </w:pPr>
-      <w:r>
-        <w:rPr>
-          <w:rFonts w:ascii="PingFang SC" w:cs="PingFang SC" w:eastAsia="PingFang SC" w:hAnsi="PingFang SC"/>
-          <w:b/>
-          <w:bCs/>
-          <w:color w:val="1C1A18"/>
-          <w:sz w:val="30"/>
-          <w:szCs w:val="30"/>
-        </w:rPr>
-        <w:t xml:space="preserve">3、可信本体的三条判据</w:t>
-      </w:r>
-    </w:p>
-    <w:p>
-      <w:pPr>
-        <w:spacing w:after="160" w:line="340"/>
-      </w:pPr>
-      <w:r>
-        <w:rPr>
-          <w:rFonts w:ascii="PingFang SC" w:cs="PingFang SC" w:eastAsia="PingFang SC" w:hAnsi="PingFang SC"/>
-          <w:color w:val="1C1A18"/>
-          <w:sz w:val="22"/>
-          <w:szCs w:val="22"/>
-        </w:rPr>
-        <w:t xml:space="preserve">一个本体要配得上"可信"这两个字，至少满足三条：</w:t>
-      </w:r>
-    </w:p>
-    <w:p>
-      <w:pPr>
-        <w:spacing w:after="160" w:line="340"/>
-      </w:pPr>
-      <w:r>
-        <w:rPr>
-          <w:rFonts w:ascii="PingFang SC" w:cs="PingFang SC" w:eastAsia="PingFang SC" w:hAnsi="PingFang SC"/>
-          <w:b/>
-          <w:bCs/>
-          <w:color w:val="1C1A18"/>
-          <w:sz w:val="22"/>
-          <w:szCs w:val="22"/>
-        </w:rPr>
-        <w:t xml:space="preserve">① 每条边有出处。</w:t>
-      </w:r>
-      <w:r>
-        <w:rPr>
-          <w:rFonts w:ascii="PingFang SC" w:cs="PingFang SC" w:eastAsia="PingFang SC" w:hAnsi="PingFang SC"/>
-          <w:color w:val="1C1A18"/>
-          <w:sz w:val="22"/>
-          <w:szCs w:val="22"/>
-        </w:rPr>
-        <w:t xml:space="preserve"> 这条断言"铸锭的氧含量是 10 ppm"——谁测的？怎么测的？在哪条证据链上？没有出处的边和编造的边没有区别。</w:t>
-      </w:r>
-    </w:p>
-    <w:p>
-      <w:pPr>
-        <w:spacing w:after="160" w:line="340"/>
-      </w:pPr>
-      <w:r>
-        <w:rPr>
-          <w:rFonts w:ascii="PingFang SC" w:cs="PingFang SC" w:eastAsia="PingFang SC" w:hAnsi="PingFang SC"/>
-          <w:b/>
-          <w:bCs/>
-          <w:color w:val="1C1A18"/>
-          <w:sz w:val="22"/>
-          <w:szCs w:val="22"/>
-        </w:rPr>
-        <w:t xml:space="preserve">② 矛盾能被自动发现。</w:t>
-      </w:r>
-      <w:r>
-        <w:rPr>
-          <w:rFonts w:ascii="PingFang SC" w:cs="PingFang SC" w:eastAsia="PingFang SC" w:hAnsi="PingFang SC"/>
-          <w:color w:val="1C1A18"/>
-          <w:sz w:val="22"/>
-          <w:szCs w:val="22"/>
-        </w:rPr>
-        <w:t xml:space="preserve"> 两条已确认的事实挂在同一个单值谓词、同一个主体、不同取值上——数学上不可能同时为真——系统必须自动报出来。</w:t>
-      </w:r>
-    </w:p>
-    <w:p>
-      <w:pPr>
-        <w:spacing w:after="160" w:line="340"/>
-      </w:pPr>
-      <w:r>
-        <w:rPr>
-          <w:rFonts w:ascii="PingFang SC" w:cs="PingFang SC" w:eastAsia="PingFang SC" w:hAnsi="PingFang SC"/>
-          <w:b/>
-          <w:bCs/>
-          <w:color w:val="1C1A18"/>
-          <w:sz w:val="22"/>
-          <w:szCs w:val="22"/>
-        </w:rPr>
-        <w:t xml:space="preserve">③ 状态可以回放到零。</w:t>
-      </w:r>
-      <w:r>
-        <w:rPr>
-          <w:rFonts w:ascii="PingFang SC" w:cs="PingFang SC" w:eastAsia="PingFang SC" w:hAnsi="PingFang SC"/>
-          <w:color w:val="1C1A18"/>
-          <w:sz w:val="22"/>
-          <w:szCs w:val="22"/>
-        </w:rPr>
-        <w:t xml:space="preserve"> 从当前的完整状态出发，能一步步还原回最初的事件流。每一条边的诞生过程都可审计。</w:t>
-      </w:r>
-    </w:p>
-    <w:p>
-      <w:pPr>
-        <w:spacing w:after="160" w:line="340"/>
-      </w:pPr>
-      <w:r>
-        <w:rPr>
-          <w:rFonts w:ascii="PingFang SC" w:cs="PingFang SC" w:eastAsia="PingFang SC" w:hAnsi="PingFang SC"/>
-          <w:color w:val="1C1A18"/>
-          <w:sz w:val="22"/>
-          <w:szCs w:val="22"/>
-        </w:rPr>
-        <w:t xml:space="preserve">ClearAI 的全部架构都在为这三条服务。</w:t>
-      </w:r>
-    </w:p>
-    <w:p>
-      <w:pPr>
-        <w:pStyle w:val="Heading2"/>
-        <w:pBdr>
-          <w:bottom w:val="single" w:color="2E75B6" w:sz="4" w:space="4"/>
-        </w:pBdr>
-        <w:spacing w:after="200" w:before="400"/>
-      </w:pPr>
-      <w:r>
-        <w:rPr>
-          <w:rFonts w:ascii="PingFang SC" w:cs="PingFang SC" w:eastAsia="PingFang SC" w:hAnsi="PingFang SC"/>
-          <w:b/>
-          <w:bCs/>
-          <w:color w:val="1C1A18"/>
-          <w:sz w:val="30"/>
-          <w:szCs w:val="30"/>
-        </w:rPr>
-        <w:t xml:space="preserve">4、本体的形态：词汇先于句子</w:t>
-      </w:r>
-    </w:p>
-    <w:p>
-      <w:pPr>
-        <w:spacing w:after="160" w:line="340"/>
-      </w:pPr>
-      <w:r>
-        <w:rPr>
-          <w:rFonts w:ascii="PingFang SC" w:cs="PingFang SC" w:eastAsia="PingFang SC" w:hAnsi="PingFang SC"/>
-          <w:color w:val="1C1A18"/>
-          <w:sz w:val="22"/>
-          <w:szCs w:val="22"/>
-        </w:rPr>
-        <w:t xml:space="preserve">一个可信本体的地基是</w:t>
-      </w:r>
-      <w:r>
-        <w:rPr>
-          <w:rFonts w:ascii="PingFang SC" w:cs="PingFang SC" w:eastAsia="PingFang SC" w:hAnsi="PingFang SC"/>
-          <w:b/>
-          <w:bCs/>
-          <w:color w:val="1C1A18"/>
-          <w:sz w:val="22"/>
-          <w:szCs w:val="22"/>
-        </w:rPr>
-        <w:t xml:space="preserve">领域语言</w:t>
-      </w:r>
-      <w:r>
-        <w:rPr>
-          <w:rFonts w:ascii="PingFang SC" w:cs="PingFang SC" w:eastAsia="PingFang SC" w:hAnsi="PingFang SC"/>
-          <w:color w:val="1C1A18"/>
-          <w:sz w:val="22"/>
-          <w:szCs w:val="22"/>
-        </w:rPr>
-        <w:t xml:space="preserve">——先定好用什么词，再用这些词说话。</w:t>
-      </w:r>
-    </w:p>
-    <w:p>
-      <w:pPr>
-        <w:pStyle w:val="Heading3"/>
-        <w:spacing w:after="140" w:before="300"/>
-      </w:pPr>
-      <w:r>
-        <w:rPr>
-          <w:rFonts w:ascii="PingFang SC" w:cs="PingFang SC" w:eastAsia="PingFang SC" w:hAnsi="PingFang SC"/>
-          <w:b/>
-          <w:bCs/>
-          <w:color w:val="1C1A18"/>
-          <w:sz w:val="25"/>
-          <w:szCs w:val="25"/>
-        </w:rPr>
-        <w:t xml:space="preserve">概念与谓词</w:t>
-      </w:r>
-    </w:p>
-    <w:p>
-      <w:pPr>
-        <w:shd w:fill="F5F4F0" w:val="clear"/>
-        <w:spacing w:after="60"/>
-        <w:ind w:left="360" w:right="360"/>
-      </w:pPr>
-    </w:p>
-    <w:p>
-      <w:pPr>
-        <w:shd w:fill="F5F4F0" w:val="clear"/>
-        <w:spacing w:after="0" w:line="280"/>
-        <w:ind w:left="360" w:right="360"/>
-      </w:pPr>
-      <w:r>
-        <w:rPr>
-          <w:rFonts w:ascii="SF Mono" w:cs="SF Mono" w:eastAsia="SF Mono" w:hAnsi="SF Mono"/>
-          <w:color w:val="333333"/>
-          <w:sz w:val="18"/>
-          <w:szCs w:val="18"/>
-        </w:rPr>
-        <w:t xml:space="preserve">RegisterTerm({</w:t>
-      </w:r>
-    </w:p>
-    <w:p>
-      <w:pPr>
-        <w:shd w:fill="F5F4F0" w:val="clear"/>
-        <w:spacing w:after="0" w:line="280"/>
-        <w:ind w:left="360" w:right="360"/>
-      </w:pPr>
-      <w:r>
-        <w:rPr>
-          <w:rFonts w:ascii="SF Mono" w:cs="SF Mono" w:eastAsia="SF Mono" w:hAnsi="SF Mono"/>
-          <w:color w:val="333333"/>
-          <w:sz w:val="18"/>
-          <w:szCs w:val="18"/>
-        </w:rPr>
-        <w:t xml:space="preserve">  id: "ingot",</w:t>
-      </w:r>
-    </w:p>
-    <w:p>
-      <w:pPr>
-        <w:shd w:fill="F5F4F0" w:val="clear"/>
-        <w:spacing w:after="0" w:line="280"/>
-        <w:ind w:left="360" w:right="360"/>
-      </w:pPr>
-      <w:r>
-        <w:rPr>
-          <w:rFonts w:ascii="SF Mono" w:cs="SF Mono" w:eastAsia="SF Mono" w:hAnsi="SF Mono"/>
-          <w:color w:val="333333"/>
-          <w:sz w:val="18"/>
-          <w:szCs w:val="18"/>
-        </w:rPr>
-        <w:t xml:space="preserve">  label: "铸锭",</w:t>
-      </w:r>
-    </w:p>
-    <w:p>
-      <w:pPr>
-        <w:shd w:fill="F5F4F0" w:val="clear"/>
-        <w:spacing w:after="0" w:line="280"/>
-        <w:ind w:left="360" w:right="360"/>
-      </w:pPr>
-      <w:r>
-        <w:rPr>
-          <w:rFonts w:ascii="SF Mono" w:cs="SF Mono" w:eastAsia="SF Mono" w:hAnsi="SF Mono"/>
-          <w:color w:val="333333"/>
-          <w:sz w:val="18"/>
-          <w:szCs w:val="18"/>
-        </w:rPr>
-        <w:t xml:space="preserve">  gloss: "立式半连续铸造产出的单根金属锭",</w:t>
-      </w:r>
-    </w:p>
-    <w:p>
-      <w:pPr>
-        <w:shd w:fill="F5F4F0" w:val="clear"/>
-        <w:spacing w:after="0" w:line="280"/>
-        <w:ind w:left="360" w:right="360"/>
-      </w:pPr>
-      <w:r>
-        <w:rPr>
-          <w:rFonts w:ascii="SF Mono" w:cs="SF Mono" w:eastAsia="SF Mono" w:hAnsi="SF Mono"/>
-          <w:color w:val="333333"/>
-          <w:sz w:val="18"/>
-          <w:szCs w:val="18"/>
-        </w:rPr>
-        <w:t xml:space="preserve">  basis: "工艺手册第 6.1 节"       // ← 必填：这个词的出处</w:t>
-      </w:r>
-    </w:p>
-    <w:p>
-      <w:pPr>
-        <w:shd w:fill="F5F4F0" w:val="clear"/>
-        <w:spacing w:after="0" w:line="280"/>
-        <w:ind w:left="360" w:right="360"/>
-      </w:pPr>
-      <w:r>
-        <w:rPr>
-          <w:rFonts w:ascii="SF Mono" w:cs="SF Mono" w:eastAsia="SF Mono" w:hAnsi="SF Mono"/>
-          <w:color w:val="333333"/>
-          <w:sz w:val="18"/>
-          <w:szCs w:val="18"/>
-        </w:rPr>
-        <w:t xml:space="preserve">})</w:t>
-      </w:r>
-    </w:p>
-    <w:p>
-      <w:pPr>
-        <w:shd w:fill="F5F4F0" w:val="clear"/>
-        <w:spacing w:after="0" w:line="280"/>
-        <w:ind w:left="360" w:right="360"/>
-      </w:pPr>
-      <w:r>
-        <w:rPr>
-          <w:rFonts w:ascii="SF Mono" w:cs="SF Mono" w:eastAsia="SF Mono" w:hAnsi="SF Mono"/>
-          <w:color w:val="333333"/>
-          <w:sz w:val="18"/>
-          <w:szCs w:val="18"/>
-        </w:rPr>
-        <w:t xml:space="preserve"/>
-      </w:r>
-    </w:p>
-    <w:p>
-      <w:pPr>
-        <w:shd w:fill="F5F4F0" w:val="clear"/>
-        <w:spacing w:after="0" w:line="280"/>
-        <w:ind w:left="360" w:right="360"/>
-      </w:pPr>
-      <w:r>
-        <w:rPr>
-          <w:rFonts w:ascii="SF Mono" w:cs="SF Mono" w:eastAsia="SF Mono" w:hAnsi="SF Mono"/>
-          <w:color w:val="333333"/>
-          <w:sz w:val="18"/>
-          <w:szCs w:val="18"/>
-        </w:rPr>
-        <w:t xml:space="preserve">RegisterPredicate({</w:t>
-      </w:r>
-    </w:p>
-    <w:p>
-      <w:pPr>
-        <w:shd w:fill="F5F4F0" w:val="clear"/>
-        <w:spacing w:after="0" w:line="280"/>
-        <w:ind w:left="360" w:right="360"/>
-      </w:pPr>
-      <w:r>
-        <w:rPr>
-          <w:rFonts w:ascii="SF Mono" w:cs="SF Mono" w:eastAsia="SF Mono" w:hAnsi="SF Mono"/>
-          <w:color w:val="333333"/>
-          <w:sz w:val="18"/>
-          <w:szCs w:val="18"/>
-        </w:rPr>
-        <w:t xml:space="preserve">  id: "oxygen_ppm",</w:t>
-      </w:r>
-    </w:p>
-    <w:p>
-      <w:pPr>
-        <w:shd w:fill="F5F4F0" w:val="clear"/>
-        <w:spacing w:after="0" w:line="280"/>
-        <w:ind w:left="360" w:right="360"/>
-      </w:pPr>
-      <w:r>
-        <w:rPr>
-          <w:rFonts w:ascii="SF Mono" w:cs="SF Mono" w:eastAsia="SF Mono" w:hAnsi="SF Mono"/>
-          <w:color w:val="333333"/>
-          <w:sz w:val="18"/>
-          <w:szCs w:val="18"/>
-        </w:rPr>
-        <w:t xml:space="preserve">  label: "氧含量检测值",</w:t>
-      </w:r>
-    </w:p>
-    <w:p>
-      <w:pPr>
-        <w:shd w:fill="F5F4F0" w:val="clear"/>
-        <w:spacing w:after="0" w:line="280"/>
-        <w:ind w:left="360" w:right="360"/>
-      </w:pPr>
-      <w:r>
-        <w:rPr>
-          <w:rFonts w:ascii="SF Mono" w:cs="SF Mono" w:eastAsia="SF Mono" w:hAnsi="SF Mono"/>
-          <w:color w:val="333333"/>
-          <w:sz w:val="18"/>
-          <w:szCs w:val="18"/>
-        </w:rPr>
-        <w:t xml:space="preserve">  domain: "ingot",                  // 主词域</w:t>
-      </w:r>
-    </w:p>
-    <w:p>
-      <w:pPr>
-        <w:shd w:fill="F5F4F0" w:val="clear"/>
-        <w:spacing w:after="0" w:line="280"/>
-        <w:ind w:left="360" w:right="360"/>
-      </w:pPr>
-      <w:r>
-        <w:rPr>
-          <w:rFonts w:ascii="SF Mono" w:cs="SF Mono" w:eastAsia="SF Mono" w:hAnsi="SF Mono"/>
-          <w:color w:val="333333"/>
-          <w:sz w:val="18"/>
-          <w:szCs w:val="18"/>
-        </w:rPr>
-        <w:t xml:space="preserve">  range: { form: "quantity", unit: "ppm" },</w:t>
-      </w:r>
-    </w:p>
-    <w:p>
-      <w:pPr>
-        <w:shd w:fill="F5F4F0" w:val="clear"/>
-        <w:spacing w:after="0" w:line="280"/>
-        <w:ind w:left="360" w:right="360"/>
-      </w:pPr>
-      <w:r>
-        <w:rPr>
-          <w:rFonts w:ascii="SF Mono" w:cs="SF Mono" w:eastAsia="SF Mono" w:hAnsi="SF Mono"/>
-          <w:color w:val="333333"/>
-          <w:sz w:val="18"/>
-          <w:szCs w:val="18"/>
-        </w:rPr>
-        <w:t xml:space="preserve">  functional: true,                 // ← 单值：同一铸锭只有一个读数</w:t>
-      </w:r>
-    </w:p>
-    <w:p>
-      <w:pPr>
-        <w:shd w:fill="F5F4F0" w:val="clear"/>
-        <w:spacing w:after="0" w:line="280"/>
-        <w:ind w:left="360" w:right="360"/>
-      </w:pPr>
-      <w:r>
-        <w:rPr>
-          <w:rFonts w:ascii="SF Mono" w:cs="SF Mono" w:eastAsia="SF Mono" w:hAnsi="SF Mono"/>
-          <w:color w:val="333333"/>
-          <w:sz w:val="18"/>
-          <w:szCs w:val="18"/>
-        </w:rPr>
-        <w:t xml:space="preserve">  basis: "ASTM E2575"</w:t>
-      </w:r>
-    </w:p>
-    <w:p>
-      <w:pPr>
-        <w:shd w:fill="F5F4F0" w:val="clear"/>
-        <w:spacing w:after="0" w:line="280"/>
-        <w:ind w:left="360" w:right="360"/>
-      </w:pPr>
-      <w:r>
-        <w:rPr>
-          <w:rFonts w:ascii="SF Mono" w:cs="SF Mono" w:eastAsia="SF Mono" w:hAnsi="SF Mono"/>
-          <w:color w:val="333333"/>
-          <w:sz w:val="18"/>
-          <w:szCs w:val="18"/>
-        </w:rPr>
-        <w:t xml:space="preserve">})</w:t>
-      </w:r>
-    </w:p>
-    <w:p>
-      <w:pPr>
-        <w:shd w:fill="F5F4F0" w:val="clear"/>
-        <w:spacing w:after="160"/>
-        <w:ind w:left="360" w:right="360"/>
-      </w:pPr>
-    </w:p>
-    <w:p>
-      <w:pPr>
-        <w:spacing w:after="160" w:line="340"/>
-      </w:pPr>
-      <w:r>
-        <w:rPr>
-          <w:rFonts w:ascii="PingFang SC" w:cs="PingFang SC" w:eastAsia="PingFang SC" w:hAnsi="PingFang SC"/>
-          <w:color w:val="1C1A18"/>
-          <w:sz w:val="22"/>
-          <w:szCs w:val="22"/>
-        </w:rPr>
-        <w:t xml:space="preserve">注意 </w:t>
-      </w:r>
-      <w:r>
-        <w:rPr>
-          <w:rFonts w:ascii="PingFang SC" w:cs="PingFang SC" w:eastAsia="PingFang SC" w:hAnsi="PingFang SC"/>
-          <w:b/>
-          <w:bCs/>
-          <w:color w:val="2E75B6"/>
-          <w:sz w:val="22"/>
-          <w:szCs w:val="22"/>
-        </w:rPr>
-        <w:t xml:space="preserve">functional: true</w:t>
-      </w:r>
-      <w:r>
-        <w:rPr>
-          <w:rFonts w:ascii="PingFang SC" w:cs="PingFang SC" w:eastAsia="PingFang SC" w:hAnsi="PingFang SC"/>
-          <w:color w:val="1C1A18"/>
-          <w:sz w:val="22"/>
-          <w:szCs w:val="22"/>
-        </w:rPr>
-        <w:t xml:space="preserve">。这是本体工程里的经典约束（描述逻辑里叫 functional property）：</w:t>
-      </w:r>
-      <w:r>
-        <w:rPr>
-          <w:rFonts w:ascii="PingFang SC" w:cs="PingFang SC" w:eastAsia="PingFang SC" w:hAnsi="PingFang SC"/>
-          <w:b/>
-          <w:bCs/>
-          <w:color w:val="1C1A18"/>
-          <w:sz w:val="22"/>
-          <w:szCs w:val="22"/>
-        </w:rPr>
-        <w:t xml:space="preserve">同一主体只能有一个取值</w:t>
-      </w:r>
-      <w:r>
-        <w:rPr>
-          <w:rFonts w:ascii="PingFang SC" w:cs="PingFang SC" w:eastAsia="PingFang SC" w:hAnsi="PingFang SC"/>
-          <w:color w:val="1C1A18"/>
-          <w:sz w:val="22"/>
-          <w:szCs w:val="22"/>
-        </w:rPr>
-        <w:t xml:space="preserve">。它的作用马上会看到——冲突检测靠它。</w:t>
-      </w:r>
-    </w:p>
-    <w:p>
-      <w:pPr>
-        <w:spacing w:after="160" w:line="340"/>
-      </w:pPr>
-      <w:r>
-        <w:rPr>
-          <w:rFonts w:ascii="PingFang SC" w:cs="PingFang SC" w:eastAsia="PingFang SC" w:hAnsi="PingFang SC"/>
-          <w:color w:val="1C1A18"/>
-          <w:sz w:val="22"/>
-          <w:szCs w:val="22"/>
-        </w:rPr>
-        <w:t xml:space="preserve">每条词汇带 basis 登记。没有依据不收。修订留版本（旧值不删）。废止写原因（黏性废止，没有删除操作）。语义变化必须换 id。</w:t>
-      </w:r>
-    </w:p>
-    <w:p>
-      <w:pPr>
-        <w:spacing w:after="160" w:line="340"/>
-      </w:pPr>
-      <w:r>
-        <w:rPr>
-          <w:rFonts w:ascii="PingFang SC" w:cs="PingFang SC" w:eastAsia="PingFang SC" w:hAnsi="PingFang SC"/>
-          <w:color w:val="1C1A18"/>
-          <w:sz w:val="22"/>
-          <w:szCs w:val="22"/>
-        </w:rPr>
-        <w:t xml:space="preserve">这是本体工程的底线：</w:t>
-      </w:r>
-      <w:r>
-        <w:rPr>
-          <w:rFonts w:ascii="PingFang SC" w:cs="PingFang SC" w:eastAsia="PingFang SC" w:hAnsi="PingFang SC"/>
-          <w:b/>
-          <w:bCs/>
-          <w:color w:val="1C1A18"/>
-          <w:sz w:val="22"/>
-          <w:szCs w:val="22"/>
-        </w:rPr>
-        <w:t xml:space="preserve">如果一个词的含义可以随时变，建立在它之上的所有断言都是沙上城堡。</w:t>
-      </w:r>
-    </w:p>
-    <w:p>
-      <w:pPr>
-        <w:pStyle w:val="Heading3"/>
-        <w:spacing w:after="140" w:before="300"/>
-      </w:pPr>
-      <w:r>
-        <w:rPr>
-          <w:rFonts w:ascii="PingFang SC" w:cs="PingFang SC" w:eastAsia="PingFang SC" w:hAnsi="PingFang SC"/>
-          <w:b/>
-          <w:bCs/>
-          <w:color w:val="1C1A18"/>
-          <w:sz w:val="25"/>
-          <w:szCs w:val="25"/>
-        </w:rPr>
-        <w:t xml:space="preserve">类型化断言</w:t>
-      </w:r>
-    </w:p>
-    <w:p>
-      <w:pPr>
-        <w:shd w:fill="F5F4F0" w:val="clear"/>
-        <w:spacing w:after="60"/>
-        <w:ind w:left="360" w:right="360"/>
-      </w:pPr>
-    </w:p>
-    <w:p>
-      <w:pPr>
-        <w:shd w:fill="F5F4F0" w:val="clear"/>
-        <w:spacing w:after="0" w:line="280"/>
-        <w:ind w:left="360" w:right="360"/>
-      </w:pPr>
-      <w:r>
-        <w:rPr>
-          <w:rFonts w:ascii="SF Mono" w:cs="SF Mono" w:eastAsia="SF Mono" w:hAnsi="SF Mono"/>
-          <w:color w:val="333333"/>
-          <w:sz w:val="18"/>
-          <w:szCs w:val="18"/>
-        </w:rPr>
-        <w:t xml:space="preserve">{</w:t>
-      </w:r>
-    </w:p>
-    <w:p>
-      <w:pPr>
-        <w:shd w:fill="F5F4F0" w:val="clear"/>
-        <w:spacing w:after="0" w:line="280"/>
-        <w:ind w:left="360" w:right="360"/>
-      </w:pPr>
-      <w:r>
-        <w:rPr>
-          <w:rFonts w:ascii="SF Mono" w:cs="SF Mono" w:eastAsia="SF Mono" w:hAnsi="SF Mono"/>
-          <w:color w:val="333333"/>
-          <w:sz w:val="18"/>
-          <w:szCs w:val="18"/>
-        </w:rPr>
-        <w:t xml:space="preserve">  predicate: "oxygen_ppm",</w:t>
-      </w:r>
-    </w:p>
-    <w:p>
-      <w:pPr>
-        <w:shd w:fill="F5F4F0" w:val="clear"/>
-        <w:spacing w:after="0" w:line="280"/>
-        <w:ind w:left="360" w:right="360"/>
-      </w:pPr>
-      <w:r>
-        <w:rPr>
-          <w:rFonts w:ascii="SF Mono" w:cs="SF Mono" w:eastAsia="SF Mono" w:hAnsi="SF Mono"/>
-          <w:color w:val="333333"/>
-          <w:sz w:val="18"/>
-          <w:szCs w:val="18"/>
-        </w:rPr>
-        <w:t xml:space="preserve">  subject:   { id: "INGOT-3", type: "ingot" },</w:t>
-      </w:r>
-    </w:p>
-    <w:p>
-      <w:pPr>
-        <w:shd w:fill="F5F4F0" w:val="clear"/>
-        <w:spacing w:after="0" w:line="280"/>
-        <w:ind w:left="360" w:right="360"/>
-      </w:pPr>
-      <w:r>
-        <w:rPr>
-          <w:rFonts w:ascii="SF Mono" w:cs="SF Mono" w:eastAsia="SF Mono" w:hAnsi="SF Mono"/>
-          <w:color w:val="333333"/>
-          <w:sz w:val="18"/>
-          <w:szCs w:val="18"/>
-        </w:rPr>
-        <w:t xml:space="preserve">  object:    { kind: "quantity", value: 10, unit: "ppm" }</w:t>
-      </w:r>
-    </w:p>
-    <w:p>
-      <w:pPr>
-        <w:shd w:fill="F5F4F0" w:val="clear"/>
-        <w:spacing w:after="0" w:line="280"/>
-        <w:ind w:left="360" w:right="360"/>
-      </w:pPr>
-      <w:r>
-        <w:rPr>
-          <w:rFonts w:ascii="SF Mono" w:cs="SF Mono" w:eastAsia="SF Mono" w:hAnsi="SF Mono"/>
-          <w:color w:val="333333"/>
-          <w:sz w:val="18"/>
-          <w:szCs w:val="18"/>
-        </w:rPr>
-        <w:t xml:space="preserve">}</w:t>
-      </w:r>
-    </w:p>
-    <w:p>
-      <w:pPr>
-        <w:shd w:fill="F5F4F0" w:val="clear"/>
-        <w:spacing w:after="160"/>
-        <w:ind w:left="360" w:right="360"/>
-      </w:pPr>
-    </w:p>
-    <w:p>
-      <w:pPr>
-        <w:spacing w:after="160" w:line="340"/>
-      </w:pPr>
-      <w:r>
-        <w:rPr>
-          <w:rFonts w:ascii="PingFang SC" w:cs="PingFang SC" w:eastAsia="PingFang SC" w:hAnsi="PingFang SC"/>
-          <w:color w:val="1C1A18"/>
-          <w:sz w:val="22"/>
-          <w:szCs w:val="22"/>
-        </w:rPr>
-        <w:t xml:space="preserve">值形态有五种，每种有明确的工程语义：</w:t>
-      </w:r>
-    </w:p>
-    <w:tbl>
-      <w:tblPr>
-        <w:tblW w:type="dxa" w:w="9936"/>
-        <w:tblBorders>
-          <w:top w:val="single" w:color="auto" w:sz="4"/>
-          <w:left w:val="single" w:color="auto" w:sz="4"/>
-          <w:bottom w:val="single" w:color="auto" w:sz="4"/>
-          <w:right w:val="single" w:color="auto" w:sz="4"/>
-          <w:insideH w:val="single" w:color="auto" w:sz="4"/>
-          <w:insideV w:val="single" w:color="auto" w:sz="4"/>
-        </w:tblBorders>
-      </w:tblPr>
-      <w:tblGrid>
-        <w:gridCol w:w="1800"/>
-        <w:gridCol w:w="3600"/>
-        <w:gridCol w:w="4536"/>
-      </w:tblGrid>
-      <w:tr>
-        <w:tc>
-          <w:tcPr>
-            <w:tcW w:type="dxa" w:w="1800"/>
-            <w:tcBorders>
-              <w:top w:val="single" w:color="DDD9D3" w:sz="1"/>
-              <w:left w:val="single" w:color="DDD9D3" w:sz="1"/>
-              <w:bottom w:val="single" w:color="DDD9D3" w:sz="1"/>
-              <w:right w:val="single" w:color="DDD9D3" w:sz="1"/>
-            </w:tcBorders>
-            <w:shd w:fill="EAF1F8" w:val="clear"/>
-            <w:tcMar>
-              <w:top w:type="dxa" w:w="60"/>
-              <w:left w:type="dxa" w:w="100"/>
-              <w:bottom w:type="dxa" w:w="60"/>
-              <w:right w:type="dxa" w:w="100"/>
-            </w:tcMar>
-          </w:tcPr>
-          <w:p>
-            <w:r>
-              <w:rPr>
-                <w:rFonts w:ascii="PingFang SC" w:cs="PingFang SC" w:eastAsia="PingFang SC" w:hAnsi="PingFang SC"/>
-                <w:b/>
-                <w:bCs/>
-                <w:color w:val="1C1A18"/>
-                <w:sz w:val="22"/>
-                <w:szCs w:val="22"/>
-              </w:rPr>
-              <w:t xml:space="preserve">形态</w:t>
-            </w:r>
-          </w:p>
-        </w:tc>
-        <w:tc>
-          <w:tcPr>
-            <w:tcW w:type="dxa" w:w="3600"/>
-            <w:tcBorders>
-              <w:top w:val="single" w:color="DDD9D3" w:sz="1"/>
-              <w:left w:val="single" w:color="DDD9D3" w:sz="1"/>
-              <w:bottom w:val="single" w:color="DDD9D3" w:sz="1"/>
-              <w:right w:val="single" w:color="DDD9D3" w:sz="1"/>
-            </w:tcBorders>
-            <w:shd w:fill="EAF1F8" w:val="clear"/>
-            <w:tcMar>
-              <w:top w:type="dxa" w:w="60"/>
-              <w:left w:type="dxa" w:w="100"/>
-              <w:bottom w:type="dxa" w:w="60"/>
-              <w:right w:type="dxa" w:w="100"/>
-            </w:tcMar>
-          </w:tcPr>
-          <w:p>
-            <w:r>
-              <w:rPr>
-                <w:rFonts w:ascii="PingFang SC" w:cs="PingFang SC" w:eastAsia="PingFang SC" w:hAnsi="PingFang SC"/>
-                <w:b/>
-                <w:bCs/>
-                <w:color w:val="1C1A18"/>
-                <w:sz w:val="22"/>
-                <w:szCs w:val="22"/>
-              </w:rPr>
-              <w:t xml:space="preserve">含义</w:t>
-            </w:r>
-          </w:p>
-        </w:tc>
-        <w:tc>
-          <w:tcPr>
-            <w:tcW w:type="dxa" w:w="4536"/>
-            <w:tcBorders>
-              <w:top w:val="single" w:color="DDD9D3" w:sz="1"/>
-              <w:left w:val="single" w:color="DDD9D3" w:sz="1"/>
-              <w:bottom w:val="single" w:color="DDD9D3" w:sz="1"/>
-              <w:right w:val="single" w:color="DDD9D3" w:sz="1"/>
-            </w:tcBorders>
-            <w:shd w:fill="EAF1F8" w:val="clear"/>
-            <w:tcMar>
-              <w:top w:type="dxa" w:w="60"/>
-              <w:left w:type="dxa" w:w="100"/>
-              <w:bottom w:type="dxa" w:w="60"/>
-              <w:right w:type="dxa" w:w="100"/>
-            </w:tcMar>
-          </w:tcPr>
-          <w:p>
-            <w:r>
-              <w:rPr>
-                <w:rFonts w:ascii="PingFang SC" w:cs="PingFang SC" w:eastAsia="PingFang SC" w:hAnsi="PingFang SC"/>
-                <w:b/>
-                <w:bCs/>
-                <w:color w:val="1C1A18"/>
-                <w:sz w:val="22"/>
-                <w:szCs w:val="22"/>
-              </w:rPr>
-              <w:t xml:space="preserve">工程价值</w:t>
-            </w:r>
-          </w:p>
-        </w:tc>
-      </w:tr>
-      <w:tr>
-        <w:tc>
-          <w:tcPr>
-            <w:tcW w:type="dxa" w:w="1800"/>
-            <w:tcBorders>
-              <w:top w:val="single" w:color="DDD9D3" w:sz="1"/>
-              <w:left w:val="single" w:color="DDD9D3" w:sz="1"/>
-              <w:bottom w:val="single" w:color="DDD9D3" w:sz="1"/>
-              <w:right w:val="single" w:color="DDD9D3" w:sz="1"/>
-            </w:tcBorders>
-            <w:tcMar>
-              <w:top w:type="dxa" w:w="60"/>
-              <w:left w:type="dxa" w:w="100"/>
-              <w:bottom w:type="dxa" w:w="60"/>
-              <w:right w:type="dxa" w:w="100"/>
-            </w:tcMar>
-          </w:tcPr>
-          <w:p>
-            <w:r>
-              <w:rPr>
-                <w:rFonts w:ascii="PingFang SC" w:cs="PingFang SC" w:eastAsia="PingFang SC" w:hAnsi="PingFang SC"/>
-                <w:color w:val="1C1A18"/>
-                <w:sz w:val="22"/>
-                <w:szCs w:val="22"/>
-              </w:rPr>
-              <w:t xml:space="preserve">statement</w:t>
-            </w:r>
-          </w:p>
-        </w:tc>
-        <w:tc>
-          <w:tcPr>
-            <w:tcW w:type="dxa" w:w="3600"/>
-            <w:tcBorders>
-              <w:top w:val="single" w:color="DDD9D3" w:sz="1"/>
-              <w:left w:val="single" w:color="DDD9D3" w:sz="1"/>
-              <w:bottom w:val="single" w:color="DDD9D3" w:sz="1"/>
-              <w:right w:val="single" w:color="DDD9D3" w:sz="1"/>
-            </w:tcBorders>
-            <w:tcMar>
-              <w:top w:type="dxa" w:w="60"/>
-              <w:left w:type="dxa" w:w="100"/>
-              <w:bottom w:type="dxa" w:w="60"/>
-              <w:right w:type="dxa" w:w="100"/>
-            </w:tcMar>
-          </w:tcPr>
-          <w:p>
-            <w:r>
-              <w:rPr>
-                <w:rFonts w:ascii="PingFang SC" w:cs="PingFang SC" w:eastAsia="PingFang SC" w:hAnsi="PingFang SC"/>
-                <w:color w:val="1C1A18"/>
-                <w:sz w:val="22"/>
-                <w:szCs w:val="22"/>
-              </w:rPr>
-              <w:t xml:space="preserve">一句可验证的陈述</w:t>
-            </w:r>
-          </w:p>
-        </w:tc>
-        <w:tc>
-          <w:tcPr>
-            <w:tcW w:type="dxa" w:w="4536"/>
-            <w:tcBorders>
-              <w:top w:val="single" w:color="DDD9D3" w:sz="1"/>
-              <w:left w:val="single" w:color="DDD9D3" w:sz="1"/>
-              <w:bottom w:val="single" w:color="DDD9D3" w:sz="1"/>
-              <w:right w:val="single" w:color="DDD9D3" w:sz="1"/>
-            </w:tcBorders>
-            <w:tcMar>
-              <w:top w:type="dxa" w:w="60"/>
-              <w:left w:type="dxa" w:w="100"/>
-              <w:bottom w:type="dxa" w:w="60"/>
-              <w:right w:type="dxa" w:w="100"/>
-            </w:tcMar>
-          </w:tcPr>
-          <w:p>
-            <w:r>
-              <w:rPr>
-                <w:rFonts w:ascii="PingFang SC" w:cs="PingFang SC" w:eastAsia="PingFang SC" w:hAnsi="PingFang SC"/>
-                <w:color w:val="1C1A18"/>
-                <w:sz w:val="22"/>
-                <w:szCs w:val="22"/>
-              </w:rPr>
-              <w:t xml:space="preserve">最低门槛的结构化</w:t>
-            </w:r>
-          </w:p>
-        </w:tc>
-      </w:tr>
-      <w:tr>
-        <w:tc>
-          <w:tcPr>
-            <w:tcW w:type="dxa" w:w="1800"/>
-            <w:tcBorders>
-              <w:top w:val="single" w:color="DDD9D3" w:sz="1"/>
-              <w:left w:val="single" w:color="DDD9D3" w:sz="1"/>
-              <w:bottom w:val="single" w:color="DDD9D3" w:sz="1"/>
-              <w:right w:val="single" w:color="DDD9D3" w:sz="1"/>
-            </w:tcBorders>
-            <w:tcMar>
-              <w:top w:type="dxa" w:w="60"/>
-              <w:left w:type="dxa" w:w="100"/>
-              <w:bottom w:type="dxa" w:w="60"/>
-              <w:right w:type="dxa" w:w="100"/>
-            </w:tcMar>
-          </w:tcPr>
-          <w:p>
-            <w:r>
-              <w:rPr>
-                <w:rFonts w:ascii="PingFang SC" w:cs="PingFang SC" w:eastAsia="PingFang SC" w:hAnsi="PingFang SC"/>
-                <w:color w:val="1C1A18"/>
-                <w:sz w:val="22"/>
-                <w:szCs w:val="22"/>
-              </w:rPr>
-              <w:t xml:space="preserve">quantity</w:t>
-            </w:r>
-          </w:p>
-        </w:tc>
-        <w:tc>
-          <w:tcPr>
-            <w:tcW w:type="dxa" w:w="3600"/>
-            <w:tcBorders>
-              <w:top w:val="single" w:color="DDD9D3" w:sz="1"/>
-              <w:left w:val="single" w:color="DDD9D3" w:sz="1"/>
-              <w:bottom w:val="single" w:color="DDD9D3" w:sz="1"/>
-              <w:right w:val="single" w:color="DDD9D3" w:sz="1"/>
-            </w:tcBorders>
-            <w:tcMar>
-              <w:top w:type="dxa" w:w="60"/>
-              <w:left w:type="dxa" w:w="100"/>
-              <w:bottom w:type="dxa" w:w="60"/>
-              <w:right w:type="dxa" w:w="100"/>
-            </w:tcMar>
-          </w:tcPr>
-          <w:p>
-            <w:r>
-              <w:rPr>
-                <w:rFonts w:ascii="PingFang SC" w:cs="PingFang SC" w:eastAsia="PingFang SC" w:hAnsi="PingFang SC"/>
-                <w:color w:val="1C1A18"/>
-                <w:sz w:val="22"/>
-                <w:szCs w:val="22"/>
-              </w:rPr>
-              <w:t xml:space="preserve">数值 + 单位</w:t>
-            </w:r>
-          </w:p>
-        </w:tc>
-        <w:tc>
-          <w:tcPr>
-            <w:tcW w:type="dxa" w:w="4536"/>
-            <w:tcBorders>
-              <w:top w:val="single" w:color="DDD9D3" w:sz="1"/>
-              <w:left w:val="single" w:color="DDD9D3" w:sz="1"/>
-              <w:bottom w:val="single" w:color="DDD9D3" w:sz="1"/>
-              <w:right w:val="single" w:color="DDD9D3" w:sz="1"/>
-            </w:tcBorders>
-            <w:tcMar>
-              <w:top w:type="dxa" w:w="60"/>
-              <w:left w:type="dxa" w:w="100"/>
-              <w:bottom w:type="dxa" w:w="60"/>
-              <w:right w:type="dxa" w:w="100"/>
-            </w:tcMar>
-          </w:tcPr>
-          <w:p>
-            <w:r>
-              <w:rPr>
-                <w:rFonts w:ascii="PingFang SC" w:cs="PingFang SC" w:eastAsia="PingFang SC" w:hAnsi="PingFang SC"/>
-                <w:color w:val="1C1A18"/>
-                <w:sz w:val="22"/>
-                <w:szCs w:val="22"/>
-              </w:rPr>
-              <w:t xml:space="preserve">可比较、可检冲突</w:t>
-            </w:r>
-          </w:p>
-        </w:tc>
-      </w:tr>
-      <w:tr>
-        <w:tc>
-          <w:tcPr>
-            <w:tcW w:type="dxa" w:w="1800"/>
-            <w:tcBorders>
-              <w:top w:val="single" w:color="DDD9D3" w:sz="1"/>
-              <w:left w:val="single" w:color="DDD9D3" w:sz="1"/>
-              <w:bottom w:val="single" w:color="DDD9D3" w:sz="1"/>
-              <w:right w:val="single" w:color="DDD9D3" w:sz="1"/>
-            </w:tcBorders>
-            <w:tcMar>
-              <w:top w:type="dxa" w:w="60"/>
-              <w:left w:type="dxa" w:w="100"/>
-              <w:bottom w:type="dxa" w:w="60"/>
-              <w:right w:type="dxa" w:w="100"/>
-            </w:tcMar>
-          </w:tcPr>
-          <w:p>
-            <w:r>
-              <w:rPr>
-                <w:rFonts w:ascii="PingFang SC" w:cs="PingFang SC" w:eastAsia="PingFang SC" w:hAnsi="PingFang SC"/>
-                <w:color w:val="1C1A18"/>
-                <w:sz w:val="22"/>
-                <w:szCs w:val="22"/>
-              </w:rPr>
-              <w:t xml:space="preserve">formula</w:t>
-            </w:r>
-          </w:p>
-        </w:tc>
-        <w:tc>
-          <w:tcPr>
-            <w:tcW w:type="dxa" w:w="3600"/>
-            <w:tcBorders>
-              <w:top w:val="single" w:color="DDD9D3" w:sz="1"/>
-              <w:left w:val="single" w:color="DDD9D3" w:sz="1"/>
-              <w:bottom w:val="single" w:color="DDD9D3" w:sz="1"/>
-              <w:right w:val="single" w:color="DDD9D3" w:sz="1"/>
-            </w:tcBorders>
-            <w:tcMar>
-              <w:top w:type="dxa" w:w="60"/>
-              <w:left w:type="dxa" w:w="100"/>
-              <w:bottom w:type="dxa" w:w="60"/>
-              <w:right w:type="dxa" w:w="100"/>
-            </w:tcMar>
-          </w:tcPr>
-          <w:p>
-            <w:r>
-              <w:rPr>
-                <w:rFonts w:ascii="PingFang SC" w:cs="PingFang SC" w:eastAsia="PingFang SC" w:hAnsi="PingFang SC"/>
-                <w:color w:val="1C1A18"/>
-                <w:sz w:val="22"/>
-                <w:szCs w:val="22"/>
-              </w:rPr>
-              <w:t xml:space="preserve">指向可重跑的公式文件</w:t>
-            </w:r>
-          </w:p>
-        </w:tc>
-        <w:tc>
-          <w:tcPr>
-            <w:tcW w:type="dxa" w:w="4536"/>
-            <w:tcBorders>
-              <w:top w:val="single" w:color="DDD9D3" w:sz="1"/>
-              <w:left w:val="single" w:color="DDD9D3" w:sz="1"/>
-              <w:bottom w:val="single" w:color="DDD9D3" w:sz="1"/>
-              <w:right w:val="single" w:color="DDD9D3" w:sz="1"/>
-            </w:tcBorders>
-            <w:tcMar>
-              <w:top w:type="dxa" w:w="60"/>
-              <w:left w:type="dxa" w:w="100"/>
-              <w:bottom w:type="dxa" w:w="60"/>
-              <w:right w:type="dxa" w:w="100"/>
-            </w:tcMar>
-          </w:tcPr>
-          <w:p>
-            <w:r>
-              <w:rPr>
-                <w:rFonts w:ascii="PingFang SC" w:cs="PingFang SC" w:eastAsia="PingFang SC" w:hAnsi="PingFang SC"/>
-                <w:color w:val="1C1A18"/>
-                <w:sz w:val="22"/>
-                <w:szCs w:val="22"/>
-              </w:rPr>
-              <w:t xml:space="preserve">可复现</w:t>
-            </w:r>
-          </w:p>
-        </w:tc>
-      </w:tr>
-      <w:tr>
-        <w:tc>
-          <w:tcPr>
-            <w:tcW w:type="dxa" w:w="1800"/>
-            <w:tcBorders>
-              <w:top w:val="single" w:color="DDD9D3" w:sz="1"/>
-              <w:left w:val="single" w:color="DDD9D3" w:sz="1"/>
-              <w:bottom w:val="single" w:color="DDD9D3" w:sz="1"/>
-              <w:right w:val="single" w:color="DDD9D3" w:sz="1"/>
-            </w:tcBorders>
-            <w:tcMar>
-              <w:top w:type="dxa" w:w="60"/>
-              <w:left w:type="dxa" w:w="100"/>
-              <w:bottom w:type="dxa" w:w="60"/>
-              <w:right w:type="dxa" w:w="100"/>
-            </w:tcMar>
-          </w:tcPr>
-          <w:p>
-            <w:r>
-              <w:rPr>
-                <w:rFonts w:ascii="PingFang SC" w:cs="PingFang SC" w:eastAsia="PingFang SC" w:hAnsi="PingFang SC"/>
-                <w:color w:val="1C1A18"/>
-                <w:sz w:val="22"/>
-                <w:szCs w:val="22"/>
-              </w:rPr>
-              <w:t xml:space="preserve">code</w:t>
-            </w:r>
-          </w:p>
-        </w:tc>
-        <w:tc>
-          <w:tcPr>
-            <w:tcW w:type="dxa" w:w="3600"/>
-            <w:tcBorders>
-              <w:top w:val="single" w:color="DDD9D3" w:sz="1"/>
-              <w:left w:val="single" w:color="DDD9D3" w:sz="1"/>
-              <w:bottom w:val="single" w:color="DDD9D3" w:sz="1"/>
-              <w:right w:val="single" w:color="DDD9D3" w:sz="1"/>
-            </w:tcBorders>
-            <w:tcMar>
-              <w:top w:type="dxa" w:w="60"/>
-              <w:left w:type="dxa" w:w="100"/>
-              <w:bottom w:type="dxa" w:w="60"/>
-              <w:right w:type="dxa" w:w="100"/>
-            </w:tcMar>
-          </w:tcPr>
-          <w:p>
-            <w:r>
-              <w:rPr>
-                <w:rFonts w:ascii="PingFang SC" w:cs="PingFang SC" w:eastAsia="PingFang SC" w:hAnsi="PingFang SC"/>
-                <w:color w:val="1C1A18"/>
-                <w:sz w:val="22"/>
-                <w:szCs w:val="22"/>
-              </w:rPr>
-              <w:t xml:space="preserve">指向可执行的代码</w:t>
-            </w:r>
-          </w:p>
-        </w:tc>
-        <w:tc>
-          <w:tcPr>
-            <w:tcW w:type="dxa" w:w="4536"/>
-            <w:tcBorders>
-              <w:top w:val="single" w:color="DDD9D3" w:sz="1"/>
-              <w:left w:val="single" w:color="DDD9D3" w:sz="1"/>
-              <w:bottom w:val="single" w:color="DDD9D3" w:sz="1"/>
-              <w:right w:val="single" w:color="DDD9D3" w:sz="1"/>
-            </w:tcBorders>
-            <w:tcMar>
-              <w:top w:type="dxa" w:w="60"/>
-              <w:left w:type="dxa" w:w="100"/>
-              <w:bottom w:type="dxa" w:w="60"/>
-              <w:right w:type="dxa" w:w="100"/>
-            </w:tcMar>
-          </w:tcPr>
-          <w:p>
-            <w:r>
-              <w:rPr>
-                <w:rFonts w:ascii="PingFang SC" w:cs="PingFang SC" w:eastAsia="PingFang SC" w:hAnsi="PingFang SC"/>
-                <w:color w:val="1C1A18"/>
-                <w:sz w:val="22"/>
-                <w:szCs w:val="22"/>
-              </w:rPr>
-              <w:t xml:space="preserve">可执行验证</w:t>
-            </w:r>
-          </w:p>
-        </w:tc>
-      </w:tr>
-      <w:tr>
-        <w:tc>
-          <w:tcPr>
-            <w:tcW w:type="dxa" w:w="1800"/>
-            <w:tcBorders>
-              <w:top w:val="single" w:color="DDD9D3" w:sz="1"/>
-              <w:left w:val="single" w:color="DDD9D3" w:sz="1"/>
-              <w:bottom w:val="single" w:color="DDD9D3" w:sz="1"/>
-              <w:right w:val="single" w:color="DDD9D3" w:sz="1"/>
-            </w:tcBorders>
-            <w:tcMar>
-              <w:top w:type="dxa" w:w="60"/>
-              <w:left w:type="dxa" w:w="100"/>
-              <w:bottom w:type="dxa" w:w="60"/>
-              <w:right w:type="dxa" w:w="100"/>
-            </w:tcMar>
-          </w:tcPr>
-          <w:p>
-            <w:r>
-              <w:rPr>
-                <w:rFonts w:ascii="PingFang SC" w:cs="PingFang SC" w:eastAsia="PingFang SC" w:hAnsi="PingFang SC"/>
-                <w:color w:val="1C1A18"/>
-                <w:sz w:val="22"/>
-                <w:szCs w:val="22"/>
-              </w:rPr>
-              <w:t xml:space="preserve">reference</w:t>
-            </w:r>
-          </w:p>
-        </w:tc>
-        <w:tc>
-          <w:tcPr>
-            <w:tcW w:type="dxa" w:w="3600"/>
-            <w:tcBorders>
-              <w:top w:val="single" w:color="DDD9D3" w:sz="1"/>
-              <w:left w:val="single" w:color="DDD9D3" w:sz="1"/>
-              <w:bottom w:val="single" w:color="DDD9D3" w:sz="1"/>
-              <w:right w:val="single" w:color="DDD9D3" w:sz="1"/>
-            </w:tcBorders>
-            <w:tcMar>
-              <w:top w:type="dxa" w:w="60"/>
-              <w:left w:type="dxa" w:w="100"/>
-              <w:bottom w:type="dxa" w:w="60"/>
-              <w:right w:type="dxa" w:w="100"/>
-            </w:tcMar>
-          </w:tcPr>
-          <w:p>
-            <w:r>
-              <w:rPr>
-                <w:rFonts w:ascii="PingFang SC" w:cs="PingFang SC" w:eastAsia="PingFang SC" w:hAnsi="PingFang SC"/>
-                <w:color w:val="1C1A18"/>
-                <w:sz w:val="22"/>
-                <w:szCs w:val="22"/>
-              </w:rPr>
-              <w:t xml:space="preserve">指向外部来源（DOI / 标准号）</w:t>
-            </w:r>
-          </w:p>
-        </w:tc>
-        <w:tc>
-          <w:tcPr>
-            <w:tcW w:type="dxa" w:w="4536"/>
-            <w:tcBorders>
-              <w:top w:val="single" w:color="DDD9D3" w:sz="1"/>
-              <w:left w:val="single" w:color="DDD9D3" w:sz="1"/>
-              <w:bottom w:val="single" w:color="DDD9D3" w:sz="1"/>
-              <w:right w:val="single" w:color="DDD9D3" w:sz="1"/>
-            </w:tcBorders>
-            <w:tcMar>
-              <w:top w:type="dxa" w:w="60"/>
-              <w:left w:type="dxa" w:w="100"/>
-              <w:bottom w:type="dxa" w:w="60"/>
-              <w:right w:type="dxa" w:w="100"/>
-            </w:tcMar>
-          </w:tcPr>
-          <w:p>
-            <w:r>
-              <w:rPr>
-                <w:rFonts w:ascii="PingFang SC" w:cs="PingFang SC" w:eastAsia="PingFang SC" w:hAnsi="PingFang SC"/>
-                <w:color w:val="1C1A18"/>
-                <w:sz w:val="22"/>
-                <w:szCs w:val="22"/>
-              </w:rPr>
-              <w:t xml:space="preserve">可追溯</w:t>
-            </w:r>
-          </w:p>
-        </w:tc>
-      </w:tr>
-    </w:tbl>
-    <w:p>
-      <w:pPr>
-        <w:spacing w:after="160" w:line="340"/>
-      </w:pPr>
-      <w:r>
-        <w:rPr>
-          <w:rFonts w:ascii="PingFang SC" w:cs="PingFang SC" w:eastAsia="PingFang SC" w:hAnsi="PingFang SC"/>
-          <w:color w:val="1C1A18"/>
-          <w:sz w:val="22"/>
-          <w:szCs w:val="22"/>
-        </w:rPr>
-        <w:t xml:space="preserve"/>
-      </w:r>
-    </w:p>
-    <w:p>
-      <w:pPr>
-        <w:pStyle w:val="Heading3"/>
-        <w:spacing w:after="140" w:before="300"/>
-      </w:pPr>
-      <w:r>
-        <w:rPr>
-          <w:rFonts w:ascii="PingFang SC" w:cs="PingFang SC" w:eastAsia="PingFang SC" w:hAnsi="PingFang SC"/>
-          <w:b/>
-          <w:bCs/>
-          <w:color w:val="1C1A18"/>
-          <w:sz w:val="25"/>
-          <w:szCs w:val="25"/>
-        </w:rPr>
-        <w:t xml:space="preserve">两张图</w:t>
-      </w:r>
-    </w:p>
-    <w:p>
-      <w:pPr>
-        <w:spacing w:after="160" w:line="340"/>
-      </w:pPr>
-      <w:r>
-        <w:rPr>
-          <w:rFonts w:ascii="PingFang SC" w:cs="PingFang SC" w:eastAsia="PingFang SC" w:hAnsi="PingFang SC"/>
-          <w:b/>
-          <w:bCs/>
-          <w:color w:val="1C1A18"/>
-          <w:sz w:val="22"/>
-          <w:szCs w:val="22"/>
-        </w:rPr>
-        <w:t xml:space="preserve">本体图</w:t>
-      </w:r>
-      <w:r>
-        <w:rPr>
-          <w:rFonts w:ascii="PingFang SC" w:cs="PingFang SC" w:eastAsia="PingFang SC" w:hAnsi="PingFang SC"/>
-          <w:color w:val="1C1A18"/>
-          <w:sz w:val="22"/>
-          <w:szCs w:val="22"/>
-        </w:rPr>
-        <w:t xml:space="preserve">：概念是节点，is_a 和谓词是边。回答"这个领域允许表达什么"。它可以在零事实的状态下存在——先立词，再提假设。语言先于句子。</w:t>
-      </w:r>
-    </w:p>
-    <w:p>
-      <w:pPr>
-        <w:spacing w:after="160" w:line="340"/>
-      </w:pPr>
-      <w:r>
-        <w:rPr>
-          <w:rFonts w:ascii="PingFang SC" w:cs="PingFang SC" w:eastAsia="PingFang SC" w:hAnsi="PingFang SC"/>
-          <w:b/>
-          <w:bCs/>
-          <w:color w:val="1C1A18"/>
-          <w:sz w:val="22"/>
-          <w:szCs w:val="22"/>
-        </w:rPr>
-        <w:t xml:space="preserve">实体图</w:t>
-      </w:r>
-      <w:r>
-        <w:rPr>
-          <w:rFonts w:ascii="PingFang SC" w:cs="PingFang SC" w:eastAsia="PingFang SC" w:hAnsi="PingFang SC"/>
-          <w:color w:val="1C1A18"/>
-          <w:sz w:val="22"/>
-          <w:szCs w:val="22"/>
-        </w:rPr>
-        <w:t xml:space="preserve">：实例是节点，断言是边，每条边带支持等级。回答"已经验证出了什么"。它只在事实升格后才有内容。挣得多少，画多少。</w:t>
-      </w:r>
-    </w:p>
-    <w:p>
-      <w:pPr>
-        <w:spacing w:after="160" w:line="340"/>
-      </w:pPr>
-      <w:r>
-        <w:rPr>
-          <w:rFonts w:ascii="PingFang SC" w:cs="PingFang SC" w:eastAsia="PingFang SC" w:hAnsi="PingFang SC"/>
-          <w:color w:val="1C1A18"/>
-          <w:sz w:val="22"/>
-          <w:szCs w:val="22"/>
-        </w:rPr>
-        <w:t xml:space="preserve">两张图都是纯函数投影——从事件流算出来的。改不了，也不用同步。</w:t>
-      </w:r>
-    </w:p>
-    <w:p>
-      <w:pPr>
         <w:spacing w:after="80" w:before="200"/>
         <w:jc w:val="center"/>
       </w:pPr>
       <w:r>
         <w:drawing>
           <wp:inline distT="0" distB="0" distL="0" distR="0">
-            <wp:extent cx="880" cy="495"/>
+            <wp:extent cx="320" cy="71"/>
             <wp:effectExtent t="0" r="0" b="0" l="0"/>
-            <wp:docPr id="1" name="docs/diagrams/epistemic-loop-hero.zh-CN.png" descr="docs/diagrams/epistemic-loop-hero.zh-CN.png" title="docs/diagrams/epistemic-loop-hero.zh-CN.png"/>
+            <wp:docPr id="1" name="brand/logo-lockup.png" descr="brand/logo-lockup.png" title="brand/logo-lockup.png"/>
             <wp:cNvGraphicFramePr>
               <a:graphicFrameLocks xmlns:a="http://schemas.openxmlformats.org/drawingml/2006/main" noChangeAspect="1"/>
             </wp:cNvGraphicFramePr>
@@ -1993,6 +148,1958 @@
                   <pic:spPr bwMode="auto">
                     <a:xfrm>
                       <a:off x="0" y="0"/>
+                      <a:ext cx="320" cy="71"/>
+                    </a:xfrm>
+                    <a:prstGeom prst="rect">
+                      <a:avLst/>
+                    </a:prstGeom>
+                  </pic:spPr>
+                </pic:pic>
+              </a:graphicData>
+            </a:graphic>
+          </wp:inline>
+        </w:drawing>
+      </w:r>
+    </w:p>
+    <w:p>
+      <w:pPr>
+        <w:spacing w:after="100" w:before="200"/>
+        <w:jc w:val="center"/>
+      </w:pPr>
+      <w:r>
+        <w:rPr>
+          <w:rFonts w:ascii="PingFang SC" w:cs="PingFang SC" w:eastAsia="PingFang SC" w:hAnsi="PingFang SC"/>
+          <w:color w:val="6B6862"/>
+          <w:sz w:val="20"/>
+          <w:szCs w:val="20"/>
+        </w:rPr>
+        <w:t xml:space="preserve">15 套件 1372 条断言 · 29 个意图工具 · 6694 行内核 · Apache-2.0</w:t>
+      </w:r>
+    </w:p>
+    <w:p>
+      <w:pPr>
+        <w:jc w:val="center"/>
+      </w:pPr>
+      <w:r>
+        <w:rPr>
+          <w:rFonts w:ascii="PingFang SC" w:cs="PingFang SC" w:eastAsia="PingFang SC" w:hAnsi="PingFang SC"/>
+          <w:b/>
+          <w:bCs/>
+          <w:color w:val="2E75B6"/>
+          <w:sz w:val="22"/>
+          <w:szCs w:val="22"/>
+        </w:rPr>
+        <w:t xml:space="preserve">npx clearai-dsh install</w:t>
+      </w:r>
+    </w:p>
+    <w:p>
+      <w:r>
+        <w:br w:type="page"/>
+      </w:r>
+    </w:p>
+    <w:p>
+      <w:pPr>
+        <w:pStyle w:val="Heading2"/>
+        <w:pBdr>
+          <w:bottom w:val="single" w:color="2E75B6" w:sz="4" w:space="4"/>
+        </w:pBdr>
+        <w:spacing w:after="200" w:before="400"/>
+      </w:pPr>
+      <w:r>
+        <w:rPr>
+          <w:rFonts w:ascii="PingFang SC" w:cs="PingFang SC" w:eastAsia="PingFang SC" w:hAnsi="PingFang SC"/>
+          <w:b/>
+          <w:bCs/>
+          <w:color w:val="1C1A18"/>
+          <w:sz w:val="30"/>
+          <w:szCs w:val="30"/>
+        </w:rPr>
+        <w:t xml:space="preserve">1、我们在解决什么问题</w:t>
+      </w:r>
+    </w:p>
+    <w:p>
+      <w:pPr>
+        <w:spacing w:after="160" w:line="340"/>
+      </w:pPr>
+      <w:r>
+        <w:rPr>
+          <w:rFonts w:ascii="PingFang SC" w:cs="PingFang SC" w:eastAsia="PingFang SC" w:hAnsi="PingFang SC"/>
+          <w:color w:val="1C1A18"/>
+          <w:sz w:val="22"/>
+          <w:szCs w:val="22"/>
+        </w:rPr>
+        <w:t xml:space="preserve">用 AI Agent 做过正经研究的人大概都撞过这堵墙。</w:t>
+      </w:r>
+    </w:p>
+    <w:p>
+      <w:pPr>
+        <w:spacing w:after="160" w:line="340"/>
+      </w:pPr>
+      <w:r>
+        <w:rPr>
+          <w:rFonts w:ascii="PingFang SC" w:cs="PingFang SC" w:eastAsia="PingFang SC" w:hAnsi="PingFang SC"/>
+          <w:color w:val="1C1A18"/>
+          <w:sz w:val="22"/>
+          <w:szCs w:val="22"/>
+        </w:rPr>
+        <w:t xml:space="preserve">你让模型调研一个技术选型，它给你一份漂亮的分析。有结构、有数据、有结论。你读完觉得有道理，准备拿去汇报。</w:t>
+      </w:r>
+    </w:p>
+    <w:p>
+      <w:pPr>
+        <w:spacing w:after="160" w:line="340"/>
+      </w:pPr>
+      <w:r>
+        <w:rPr>
+          <w:rFonts w:ascii="PingFang SC" w:cs="PingFang SC" w:eastAsia="PingFang SC" w:hAnsi="PingFang SC"/>
+          <w:color w:val="1C1A18"/>
+          <w:sz w:val="22"/>
+          <w:szCs w:val="22"/>
+        </w:rPr>
+        <w:t xml:space="preserve">然后有人问：</w:t>
+      </w:r>
+      <w:r>
+        <w:rPr>
+          <w:rFonts w:ascii="PingFang SC" w:cs="PingFang SC" w:eastAsia="PingFang SC" w:hAnsi="PingFang SC"/>
+          <w:b/>
+          <w:bCs/>
+          <w:color w:val="1C1A18"/>
+          <w:sz w:val="22"/>
+          <w:szCs w:val="22"/>
+        </w:rPr>
+        <w:t xml:space="preserve">"这个结论怎么验证的？证据在哪？"</w:t>
+      </w:r>
+    </w:p>
+    <w:p>
+      <w:pPr>
+        <w:spacing w:after="160" w:line="340"/>
+      </w:pPr>
+      <w:r>
+        <w:rPr>
+          <w:rFonts w:ascii="PingFang SC" w:cs="PingFang SC" w:eastAsia="PingFang SC" w:hAnsi="PingFang SC"/>
+          <w:color w:val="1C1A18"/>
+          <w:sz w:val="22"/>
+          <w:szCs w:val="22"/>
+        </w:rPr>
+        <w:t xml:space="preserve">你翻聊天记录。证据散落在十几轮对话里，有的在工具输出里，有的在模型自己的推理链里，有的根本没有。你甚至不确定模型是推理出来的还是编出来的。</w:t>
+      </w:r>
+    </w:p>
+    <w:p>
+      <w:pPr>
+        <w:spacing w:after="160" w:line="340"/>
+      </w:pPr>
+      <w:r>
+        <w:rPr>
+          <w:rFonts w:ascii="PingFang SC" w:cs="PingFang SC" w:eastAsia="PingFang SC" w:hAnsi="PingFang SC"/>
+          <w:color w:val="1C1A18"/>
+          <w:sz w:val="22"/>
+          <w:szCs w:val="22"/>
+        </w:rPr>
+        <w:t xml:space="preserve">这件事的本质：</w:t>
+      </w:r>
+      <w:r>
+        <w:rPr>
+          <w:rFonts w:ascii="PingFang SC" w:cs="PingFang SC" w:eastAsia="PingFang SC" w:hAnsi="PingFang SC"/>
+          <w:b/>
+          <w:bCs/>
+          <w:color w:val="1C1A18"/>
+          <w:sz w:val="22"/>
+          <w:szCs w:val="22"/>
+        </w:rPr>
+        <w:t xml:space="preserve">Agent 架构里没有一个地方存放"这个结论凭什么成立"。</w:t>
+      </w:r>
+      <w:r>
+        <w:rPr>
+          <w:rFonts w:ascii="PingFang SC" w:cs="PingFang SC" w:eastAsia="PingFang SC" w:hAnsi="PingFang SC"/>
+          <w:color w:val="1C1A18"/>
+          <w:sz w:val="22"/>
+          <w:szCs w:val="22"/>
+        </w:rPr>
+        <w:t xml:space="preserve">聊天记录不存这个，向量数据库不存这个，LangGraph 的 state graph 也不存这个。</w:t>
+      </w:r>
+    </w:p>
+    <w:p>
+      <w:pPr>
+        <w:spacing w:after="160" w:line="340"/>
+      </w:pPr>
+      <w:r>
+        <w:rPr>
+          <w:rFonts w:ascii="PingFang SC" w:cs="PingFang SC" w:eastAsia="PingFang SC" w:hAnsi="PingFang SC"/>
+          <w:color w:val="1C1A18"/>
+          <w:sz w:val="22"/>
+          <w:szCs w:val="22"/>
+        </w:rPr>
+        <w:t xml:space="preserve">同时，你希望研究产出能</w:t>
+      </w:r>
+      <w:r>
+        <w:rPr>
+          <w:rFonts w:ascii="PingFang SC" w:cs="PingFang SC" w:eastAsia="PingFang SC" w:hAnsi="PingFang SC"/>
+          <w:b/>
+          <w:bCs/>
+          <w:color w:val="1C1A18"/>
+          <w:sz w:val="22"/>
+          <w:szCs w:val="22"/>
+        </w:rPr>
+        <w:t xml:space="preserve">积累</w:t>
+      </w:r>
+      <w:r>
+        <w:rPr>
+          <w:rFonts w:ascii="PingFang SC" w:cs="PingFang SC" w:eastAsia="PingFang SC" w:hAnsi="PingFang SC"/>
+          <w:color w:val="1C1A18"/>
+          <w:sz w:val="22"/>
+          <w:szCs w:val="22"/>
+        </w:rPr>
+        <w:t xml:space="preserve">——今天做完的调研，明天换一个人还能接着用。积累需要一个结构化的形态。</w:t>
+      </w:r>
+    </w:p>
+    <w:p>
+      <w:pPr>
+        <w:spacing w:after="160" w:line="340"/>
+      </w:pPr>
+      <w:r>
+        <w:rPr>
+          <w:rFonts w:ascii="PingFang SC" w:cs="PingFang SC" w:eastAsia="PingFang SC" w:hAnsi="PingFang SC"/>
+          <w:color w:val="1C1A18"/>
+          <w:sz w:val="22"/>
+          <w:szCs w:val="22"/>
+        </w:rPr>
+        <w:t xml:space="preserve">我们的判断：这个形态是</w:t>
+      </w:r>
+      <w:r>
+        <w:rPr>
+          <w:rFonts w:ascii="PingFang SC" w:cs="PingFang SC" w:eastAsia="PingFang SC" w:hAnsi="PingFang SC"/>
+          <w:b/>
+          <w:bCs/>
+          <w:color w:val="1C1A18"/>
+          <w:sz w:val="22"/>
+          <w:szCs w:val="22"/>
+        </w:rPr>
+        <w:t xml:space="preserve">领域本体</w:t>
+      </w:r>
+      <w:r>
+        <w:rPr>
+          <w:rFonts w:ascii="PingFang SC" w:cs="PingFang SC" w:eastAsia="PingFang SC" w:hAnsi="PingFang SC"/>
+          <w:color w:val="1C1A18"/>
+          <w:sz w:val="22"/>
+          <w:szCs w:val="22"/>
+        </w:rPr>
+        <w:t xml:space="preserve">（domain ontology），而让本体里的每条边都可信的那套工艺是</w:t>
+      </w:r>
+      <w:r>
+        <w:rPr>
+          <w:rFonts w:ascii="PingFang SC" w:cs="PingFang SC" w:eastAsia="PingFang SC" w:hAnsi="PingFang SC"/>
+          <w:b/>
+          <w:bCs/>
+          <w:color w:val="1C1A18"/>
+          <w:sz w:val="22"/>
+          <w:szCs w:val="22"/>
+        </w:rPr>
+        <w:t xml:space="preserve">认识论循环</w:t>
+      </w:r>
+      <w:r>
+        <w:rPr>
+          <w:rFonts w:ascii="PingFang SC" w:cs="PingFang SC" w:eastAsia="PingFang SC" w:hAnsi="PingFang SC"/>
+          <w:color w:val="1C1A18"/>
+          <w:sz w:val="22"/>
+          <w:szCs w:val="22"/>
+        </w:rPr>
+        <w:t xml:space="preserve">（epistemic loop）。ClearAI 把两者做成了一个 DSH 插件：</w:t>
+      </w:r>
+    </w:p>
+    <w:p>
+      <w:pPr>
+        <w:pBdr>
+          <w:left w:val="single" w:color="2E75B6" w:sz="12" w:space="8"/>
+        </w:pBdr>
+        <w:spacing w:after="160" w:before="120"/>
+        <w:ind w:left="480"/>
+      </w:pPr>
+      <w:r>
+        <w:rPr>
+          <w:rFonts w:ascii="PingFang SC" w:cs="PingFang SC" w:eastAsia="PingFang SC" w:hAnsi="PingFang SC"/>
+          <w:b/>
+          <w:bCs/>
+          <w:color w:val="1C1A18"/>
+          <w:sz w:val="22"/>
+          <w:szCs w:val="22"/>
+        </w:rPr>
+        <w:t xml:space="preserve">AI 在你的项目里长出一个活的领域本体，每条边都通过验证循环挣得它的位置。</w:t>
+      </w:r>
+    </w:p>
+    <w:p>
+      <w:pPr>
+        <w:pStyle w:val="Heading2"/>
+        <w:pBdr>
+          <w:bottom w:val="single" w:color="2E75B6" w:sz="4" w:space="4"/>
+        </w:pBdr>
+        <w:spacing w:after="200" w:before="400"/>
+      </w:pPr>
+      <w:r>
+        <w:rPr>
+          <w:rFonts w:ascii="PingFang SC" w:cs="PingFang SC" w:eastAsia="PingFang SC" w:hAnsi="PingFang SC"/>
+          <w:b/>
+          <w:bCs/>
+          <w:color w:val="1C1A18"/>
+          <w:sz w:val="30"/>
+          <w:szCs w:val="30"/>
+        </w:rPr>
+        <w:t xml:space="preserve">2、本体是终点，认识论是到达终点的路</w:t>
+      </w:r>
+    </w:p>
+    <w:p>
+      <w:pPr>
+        <w:spacing w:after="160" w:line="340"/>
+      </w:pPr>
+      <w:r>
+        <w:rPr>
+          <w:rFonts w:ascii="PingFang SC" w:cs="PingFang SC" w:eastAsia="PingFang SC" w:hAnsi="PingFang SC"/>
+          <w:color w:val="1C1A18"/>
+          <w:sz w:val="22"/>
+          <w:szCs w:val="22"/>
+        </w:rPr>
+        <w:t xml:space="preserve">两个词经常被混着用，先把关系说清楚。</w:t>
+      </w:r>
+    </w:p>
+    <w:p>
+      <w:pPr>
+        <w:spacing w:after="160" w:line="340"/>
+      </w:pPr>
+      <w:r>
+        <w:rPr>
+          <w:rFonts w:ascii="PingFang SC" w:cs="PingFang SC" w:eastAsia="PingFang SC" w:hAnsi="PingFang SC"/>
+          <w:b/>
+          <w:bCs/>
+          <w:color w:val="1C1A18"/>
+          <w:sz w:val="22"/>
+          <w:szCs w:val="22"/>
+        </w:rPr>
+        <w:t xml:space="preserve">本体论</w:t>
+      </w:r>
+      <w:r>
+        <w:rPr>
+          <w:rFonts w:ascii="PingFang SC" w:cs="PingFang SC" w:eastAsia="PingFang SC" w:hAnsi="PingFang SC"/>
+          <w:color w:val="1C1A18"/>
+          <w:sz w:val="22"/>
+          <w:szCs w:val="22"/>
+        </w:rPr>
+        <w:t xml:space="preserve">（ontology）回答的问题是：这个世界有哪些类的东西？它们之间有什么关系？在工程语境里，本体的产出是</w:t>
+      </w:r>
+      <w:r>
+        <w:rPr>
+          <w:rFonts w:ascii="PingFang SC" w:cs="PingFang SC" w:eastAsia="PingFang SC" w:hAnsi="PingFang SC"/>
+          <w:b/>
+          <w:bCs/>
+          <w:color w:val="1C1A18"/>
+          <w:sz w:val="22"/>
+          <w:szCs w:val="22"/>
+        </w:rPr>
+        <w:t xml:space="preserve">一组概念、一组谓词、一组实例和它们之间的关系</w:t>
+      </w:r>
+      <w:r>
+        <w:rPr>
+          <w:rFonts w:ascii="PingFang SC" w:cs="PingFang SC" w:eastAsia="PingFang SC" w:hAnsi="PingFang SC"/>
+          <w:color w:val="1C1A18"/>
+          <w:sz w:val="22"/>
+          <w:szCs w:val="22"/>
+        </w:rPr>
+        <w:t xml:space="preserve">——一个结构化的知识库。</w:t>
+      </w:r>
+    </w:p>
+    <w:p>
+      <w:pPr>
+        <w:spacing w:after="160" w:line="340"/>
+      </w:pPr>
+      <w:r>
+        <w:rPr>
+          <w:rFonts w:ascii="PingFang SC" w:cs="PingFang SC" w:eastAsia="PingFang SC" w:hAnsi="PingFang SC"/>
+          <w:b/>
+          <w:bCs/>
+          <w:color w:val="1C1A18"/>
+          <w:sz w:val="22"/>
+          <w:szCs w:val="22"/>
+        </w:rPr>
+        <w:t xml:space="preserve">认识论</w:t>
+      </w:r>
+      <w:r>
+        <w:rPr>
+          <w:rFonts w:ascii="PingFang SC" w:cs="PingFang SC" w:eastAsia="PingFang SC" w:hAnsi="PingFang SC"/>
+          <w:color w:val="1C1A18"/>
+          <w:sz w:val="22"/>
+          <w:szCs w:val="22"/>
+        </w:rPr>
+        <w:t xml:space="preserve">（epistemology）回答的问题是：一个信念凭什么算知识？证据怎么支持结论？在工程语境里，认识论的产出是</w:t>
+      </w:r>
+      <w:r>
+        <w:rPr>
+          <w:rFonts w:ascii="PingFang SC" w:cs="PingFang SC" w:eastAsia="PingFang SC" w:hAnsi="PingFang SC"/>
+          <w:b/>
+          <w:bCs/>
+          <w:color w:val="1C1A18"/>
+          <w:sz w:val="22"/>
+          <w:szCs w:val="22"/>
+        </w:rPr>
+        <w:t xml:space="preserve">一套验证机制</w:t>
+      </w:r>
+      <w:r>
+        <w:rPr>
+          <w:rFonts w:ascii="PingFang SC" w:cs="PingFang SC" w:eastAsia="PingFang SC" w:hAnsi="PingFang SC"/>
+          <w:color w:val="1C1A18"/>
+          <w:sz w:val="22"/>
+          <w:szCs w:val="22"/>
+        </w:rPr>
+        <w:t xml:space="preserve">——判据怎么登记、证据怎么分级、结论怎么裁决。</w:t>
+      </w:r>
+    </w:p>
+    <w:p>
+      <w:pPr>
+        <w:spacing w:after="160" w:line="340"/>
+      </w:pPr>
+      <w:r>
+        <w:rPr>
+          <w:rFonts w:ascii="PingFang SC" w:cs="PingFang SC" w:eastAsia="PingFang SC" w:hAnsi="PingFang SC"/>
+          <w:color w:val="1C1A18"/>
+          <w:sz w:val="22"/>
+          <w:szCs w:val="22"/>
+        </w:rPr>
+        <w:t xml:space="preserve">两者的关系用一个比喻：</w:t>
+      </w:r>
+    </w:p>
+    <w:p>
+      <w:pPr>
+        <w:pStyle w:val="ListParagraph"/>
+        <w:numPr>
+          <w:ilvl w:val="0"/>
+          <w:numId w:val="1"/>
+        </w:numPr>
+        <w:spacing w:after="100" w:line="320"/>
+      </w:pPr>
+      <w:r>
+        <w:rPr>
+          <w:rFonts w:ascii="PingFang SC" w:cs="PingFang SC" w:eastAsia="PingFang SC" w:hAnsi="PingFang SC"/>
+          <w:b/>
+          <w:bCs/>
+          <w:color w:val="1C1A18"/>
+          <w:sz w:val="22"/>
+          <w:szCs w:val="22"/>
+        </w:rPr>
+        <w:t xml:space="preserve">本体是房子</w:t>
+      </w:r>
+      <w:r>
+        <w:rPr>
+          <w:rFonts w:ascii="PingFang SC" w:cs="PingFang SC" w:eastAsia="PingFang SC" w:hAnsi="PingFang SC"/>
+          <w:color w:val="1C1A18"/>
+          <w:sz w:val="22"/>
+          <w:szCs w:val="22"/>
+        </w:rPr>
+        <w:t xml:space="preserve">——你要住的地方，最终交付的东西。</w:t>
+      </w:r>
+    </w:p>
+    <w:p>
+      <w:pPr>
+        <w:pStyle w:val="ListParagraph"/>
+        <w:numPr>
+          <w:ilvl w:val="0"/>
+          <w:numId w:val="1"/>
+        </w:numPr>
+        <w:spacing w:after="100" w:line="320"/>
+      </w:pPr>
+      <w:r>
+        <w:rPr>
+          <w:rFonts w:ascii="PingFang SC" w:cs="PingFang SC" w:eastAsia="PingFang SC" w:hAnsi="PingFang SC"/>
+          <w:b/>
+          <w:bCs/>
+          <w:color w:val="1C1A18"/>
+          <w:sz w:val="22"/>
+          <w:szCs w:val="22"/>
+        </w:rPr>
+        <w:t xml:space="preserve">认识论是施工规范</w:t>
+      </w:r>
+      <w:r>
+        <w:rPr>
+          <w:rFonts w:ascii="PingFang SC" w:cs="PingFang SC" w:eastAsia="PingFang SC" w:hAnsi="PingFang SC"/>
+          <w:color w:val="1C1A18"/>
+          <w:sz w:val="22"/>
+          <w:szCs w:val="22"/>
+        </w:rPr>
+        <w:t xml:space="preserve">——地基怎么打、钢筋怎么焊、验收怎么做。</w:t>
+      </w:r>
+    </w:p>
+    <w:p>
+      <w:pPr>
+        <w:spacing w:after="160" w:line="340"/>
+      </w:pPr>
+      <w:r>
+        <w:rPr>
+          <w:rFonts w:ascii="PingFang SC" w:cs="PingFang SC" w:eastAsia="PingFang SC" w:hAnsi="PingFang SC"/>
+          <w:color w:val="1C1A18"/>
+          <w:sz w:val="22"/>
+          <w:szCs w:val="22"/>
+        </w:rPr>
+        <w:t xml:space="preserve">没有施工规范的房子也能盖起来，看起来像模像样。但你敢住吗？</w:t>
+      </w:r>
+    </w:p>
+    <w:p>
+      <w:pPr>
+        <w:spacing w:after="160" w:line="340"/>
+      </w:pPr>
+      <w:r>
+        <w:rPr>
+          <w:rFonts w:ascii="PingFang SC" w:cs="PingFang SC" w:eastAsia="PingFang SC" w:hAnsi="PingFang SC"/>
+          <w:color w:val="1C1A18"/>
+          <w:sz w:val="22"/>
+          <w:szCs w:val="22"/>
+        </w:rPr>
+        <w:t xml:space="preserve">市面上绝大多数"AI + 知识图谱"的做法是：让 LLM 从文本里抽取实体和关系，直接画到图上。这相当于</w:t>
+      </w:r>
+      <w:r>
+        <w:rPr>
+          <w:rFonts w:ascii="PingFang SC" w:cs="PingFang SC" w:eastAsia="PingFang SC" w:hAnsi="PingFang SC"/>
+          <w:b/>
+          <w:bCs/>
+          <w:color w:val="1C1A18"/>
+          <w:sz w:val="22"/>
+          <w:szCs w:val="22"/>
+        </w:rPr>
+        <w:t xml:space="preserve">让一个没有资质的承包商凭感觉盖房子</w:t>
+      </w:r>
+      <w:r>
+        <w:rPr>
+          <w:rFonts w:ascii="PingFang SC" w:cs="PingFang SC" w:eastAsia="PingFang SC" w:hAnsi="PingFang SC"/>
+          <w:color w:val="1C1A18"/>
+          <w:sz w:val="22"/>
+          <w:szCs w:val="22"/>
+        </w:rPr>
+        <w:t xml:space="preserve">。速度很快，外观很漂亮，但你不知道墙里有没有钢筋。</w:t>
+      </w:r>
+    </w:p>
+    <w:p>
+      <w:pPr>
+        <w:spacing w:after="160" w:line="340"/>
+      </w:pPr>
+      <w:r>
+        <w:rPr>
+          <w:rFonts w:ascii="PingFang SC" w:cs="PingFang SC" w:eastAsia="PingFang SC" w:hAnsi="PingFang SC"/>
+          <w:color w:val="1C1A18"/>
+          <w:sz w:val="22"/>
+          <w:szCs w:val="22"/>
+        </w:rPr>
+        <w:t xml:space="preserve">ClearAI 的做法：每一块砖（每一条断言）都要过验收（验证循环），验收记录（证据链）跟着砖走，房子盖完时每面墙都可以追溯到验收单。</w:t>
+      </w:r>
+    </w:p>
+    <w:p>
+      <w:pPr>
+        <w:spacing w:after="160" w:line="340"/>
+      </w:pPr>
+      <w:r>
+        <w:rPr>
+          <w:rFonts w:ascii="PingFang SC" w:cs="PingFang SC" w:eastAsia="PingFang SC" w:hAnsi="PingFang SC"/>
+          <w:b/>
+          <w:bCs/>
+          <w:color w:val="1C1A18"/>
+          <w:sz w:val="22"/>
+          <w:szCs w:val="22"/>
+        </w:rPr>
+        <w:t xml:space="preserve">本体是交付物，认识论是质量体系。缺了质量体系的交付物，不敢用。</w:t>
+      </w:r>
+    </w:p>
+    <w:p>
+      <w:pPr>
+        <w:pStyle w:val="Heading2"/>
+        <w:pBdr>
+          <w:bottom w:val="single" w:color="2E75B6" w:sz="4" w:space="4"/>
+        </w:pBdr>
+        <w:spacing w:after="200" w:before="400"/>
+      </w:pPr>
+      <w:r>
+        <w:rPr>
+          <w:rFonts w:ascii="PingFang SC" w:cs="PingFang SC" w:eastAsia="PingFang SC" w:hAnsi="PingFang SC"/>
+          <w:b/>
+          <w:bCs/>
+          <w:color w:val="1C1A18"/>
+          <w:sz w:val="30"/>
+          <w:szCs w:val="30"/>
+        </w:rPr>
+        <w:t xml:space="preserve">3、可信本体的三条判据</w:t>
+      </w:r>
+    </w:p>
+    <w:p>
+      <w:pPr>
+        <w:spacing w:after="160" w:line="340"/>
+      </w:pPr>
+      <w:r>
+        <w:rPr>
+          <w:rFonts w:ascii="PingFang SC" w:cs="PingFang SC" w:eastAsia="PingFang SC" w:hAnsi="PingFang SC"/>
+          <w:color w:val="1C1A18"/>
+          <w:sz w:val="22"/>
+          <w:szCs w:val="22"/>
+        </w:rPr>
+        <w:t xml:space="preserve">一个本体要配得上"可信"这两个字，至少满足三条：</w:t>
+      </w:r>
+    </w:p>
+    <w:p>
+      <w:pPr>
+        <w:spacing w:after="160" w:line="340"/>
+      </w:pPr>
+      <w:r>
+        <w:rPr>
+          <w:rFonts w:ascii="PingFang SC" w:cs="PingFang SC" w:eastAsia="PingFang SC" w:hAnsi="PingFang SC"/>
+          <w:b/>
+          <w:bCs/>
+          <w:color w:val="1C1A18"/>
+          <w:sz w:val="22"/>
+          <w:szCs w:val="22"/>
+        </w:rPr>
+        <w:t xml:space="preserve">① 每条边有出处。</w:t>
+      </w:r>
+      <w:r>
+        <w:rPr>
+          <w:rFonts w:ascii="PingFang SC" w:cs="PingFang SC" w:eastAsia="PingFang SC" w:hAnsi="PingFang SC"/>
+          <w:color w:val="1C1A18"/>
+          <w:sz w:val="22"/>
+          <w:szCs w:val="22"/>
+        </w:rPr>
+        <w:t xml:space="preserve"> 这条断言"铸锭的氧含量是 10 ppm"——谁测的？怎么测的？在哪条证据链上？没有出处的边和编造的边没有区别。</w:t>
+      </w:r>
+    </w:p>
+    <w:p>
+      <w:pPr>
+        <w:spacing w:after="160" w:line="340"/>
+      </w:pPr>
+      <w:r>
+        <w:rPr>
+          <w:rFonts w:ascii="PingFang SC" w:cs="PingFang SC" w:eastAsia="PingFang SC" w:hAnsi="PingFang SC"/>
+          <w:b/>
+          <w:bCs/>
+          <w:color w:val="1C1A18"/>
+          <w:sz w:val="22"/>
+          <w:szCs w:val="22"/>
+        </w:rPr>
+        <w:t xml:space="preserve">② 矛盾能被自动发现。</w:t>
+      </w:r>
+      <w:r>
+        <w:rPr>
+          <w:rFonts w:ascii="PingFang SC" w:cs="PingFang SC" w:eastAsia="PingFang SC" w:hAnsi="PingFang SC"/>
+          <w:color w:val="1C1A18"/>
+          <w:sz w:val="22"/>
+          <w:szCs w:val="22"/>
+        </w:rPr>
+        <w:t xml:space="preserve"> 两条已确认的事实挂在同一个单值谓词、同一个主体、不同取值上——数学上不可能同时为真——系统必须自动报出来。</w:t>
+      </w:r>
+    </w:p>
+    <w:p>
+      <w:pPr>
+        <w:spacing w:after="160" w:line="340"/>
+      </w:pPr>
+      <w:r>
+        <w:rPr>
+          <w:rFonts w:ascii="PingFang SC" w:cs="PingFang SC" w:eastAsia="PingFang SC" w:hAnsi="PingFang SC"/>
+          <w:b/>
+          <w:bCs/>
+          <w:color w:val="1C1A18"/>
+          <w:sz w:val="22"/>
+          <w:szCs w:val="22"/>
+        </w:rPr>
+        <w:t xml:space="preserve">③ 状态可以回放到零。</w:t>
+      </w:r>
+      <w:r>
+        <w:rPr>
+          <w:rFonts w:ascii="PingFang SC" w:cs="PingFang SC" w:eastAsia="PingFang SC" w:hAnsi="PingFang SC"/>
+          <w:color w:val="1C1A18"/>
+          <w:sz w:val="22"/>
+          <w:szCs w:val="22"/>
+        </w:rPr>
+        <w:t xml:space="preserve"> 从当前的完整状态出发，能一步步还原回最初的事件流。每一条边的诞生过程都可审计。</w:t>
+      </w:r>
+    </w:p>
+    <w:p>
+      <w:pPr>
+        <w:spacing w:after="160" w:line="340"/>
+      </w:pPr>
+      <w:r>
+        <w:rPr>
+          <w:rFonts w:ascii="PingFang SC" w:cs="PingFang SC" w:eastAsia="PingFang SC" w:hAnsi="PingFang SC"/>
+          <w:color w:val="1C1A18"/>
+          <w:sz w:val="22"/>
+          <w:szCs w:val="22"/>
+        </w:rPr>
+        <w:t xml:space="preserve">ClearAI 的全部架构都在为这三条服务。</w:t>
+      </w:r>
+    </w:p>
+    <w:p>
+      <w:pPr>
+        <w:pStyle w:val="Heading2"/>
+        <w:pBdr>
+          <w:bottom w:val="single" w:color="2E75B6" w:sz="4" w:space="4"/>
+        </w:pBdr>
+        <w:spacing w:after="200" w:before="400"/>
+      </w:pPr>
+      <w:r>
+        <w:rPr>
+          <w:rFonts w:ascii="PingFang SC" w:cs="PingFang SC" w:eastAsia="PingFang SC" w:hAnsi="PingFang SC"/>
+          <w:b/>
+          <w:bCs/>
+          <w:color w:val="1C1A18"/>
+          <w:sz w:val="30"/>
+          <w:szCs w:val="30"/>
+        </w:rPr>
+        <w:t xml:space="preserve">4、本体的形态：词汇先于句子</w:t>
+      </w:r>
+    </w:p>
+    <w:p>
+      <w:pPr>
+        <w:spacing w:after="160" w:line="340"/>
+      </w:pPr>
+      <w:r>
+        <w:rPr>
+          <w:rFonts w:ascii="PingFang SC" w:cs="PingFang SC" w:eastAsia="PingFang SC" w:hAnsi="PingFang SC"/>
+          <w:color w:val="1C1A18"/>
+          <w:sz w:val="22"/>
+          <w:szCs w:val="22"/>
+        </w:rPr>
+        <w:t xml:space="preserve">一个可信本体的地基是</w:t>
+      </w:r>
+      <w:r>
+        <w:rPr>
+          <w:rFonts w:ascii="PingFang SC" w:cs="PingFang SC" w:eastAsia="PingFang SC" w:hAnsi="PingFang SC"/>
+          <w:b/>
+          <w:bCs/>
+          <w:color w:val="1C1A18"/>
+          <w:sz w:val="22"/>
+          <w:szCs w:val="22"/>
+        </w:rPr>
+        <w:t xml:space="preserve">领域语言</w:t>
+      </w:r>
+      <w:r>
+        <w:rPr>
+          <w:rFonts w:ascii="PingFang SC" w:cs="PingFang SC" w:eastAsia="PingFang SC" w:hAnsi="PingFang SC"/>
+          <w:color w:val="1C1A18"/>
+          <w:sz w:val="22"/>
+          <w:szCs w:val="22"/>
+        </w:rPr>
+        <w:t xml:space="preserve">——先定好用什么词，再用这些词说话。</w:t>
+      </w:r>
+    </w:p>
+    <w:p>
+      <w:pPr>
+        <w:pStyle w:val="Heading3"/>
+        <w:spacing w:after="140" w:before="300"/>
+      </w:pPr>
+      <w:r>
+        <w:rPr>
+          <w:rFonts w:ascii="PingFang SC" w:cs="PingFang SC" w:eastAsia="PingFang SC" w:hAnsi="PingFang SC"/>
+          <w:b/>
+          <w:bCs/>
+          <w:color w:val="1C1A18"/>
+          <w:sz w:val="25"/>
+          <w:szCs w:val="25"/>
+        </w:rPr>
+        <w:t xml:space="preserve">概念与谓词</w:t>
+      </w:r>
+    </w:p>
+    <w:p>
+      <w:pPr>
+        <w:shd w:fill="F5F4F0" w:val="clear"/>
+        <w:spacing w:after="60"/>
+        <w:ind w:left="360" w:right="360"/>
+      </w:pPr>
+    </w:p>
+    <w:p>
+      <w:pPr>
+        <w:shd w:fill="F5F4F0" w:val="clear"/>
+        <w:spacing w:after="0" w:line="280"/>
+        <w:ind w:left="360" w:right="360"/>
+      </w:pPr>
+      <w:r>
+        <w:rPr>
+          <w:rFonts w:ascii="SF Mono" w:cs="SF Mono" w:eastAsia="SF Mono" w:hAnsi="SF Mono"/>
+          <w:color w:val="333333"/>
+          <w:sz w:val="18"/>
+          <w:szCs w:val="18"/>
+        </w:rPr>
+        <w:t xml:space="preserve">RegisterTerm({</w:t>
+      </w:r>
+    </w:p>
+    <w:p>
+      <w:pPr>
+        <w:shd w:fill="F5F4F0" w:val="clear"/>
+        <w:spacing w:after="0" w:line="280"/>
+        <w:ind w:left="360" w:right="360"/>
+      </w:pPr>
+      <w:r>
+        <w:rPr>
+          <w:rFonts w:ascii="SF Mono" w:cs="SF Mono" w:eastAsia="SF Mono" w:hAnsi="SF Mono"/>
+          <w:color w:val="333333"/>
+          <w:sz w:val="18"/>
+          <w:szCs w:val="18"/>
+        </w:rPr>
+        <w:t xml:space="preserve">  id: "ingot",</w:t>
+      </w:r>
+    </w:p>
+    <w:p>
+      <w:pPr>
+        <w:shd w:fill="F5F4F0" w:val="clear"/>
+        <w:spacing w:after="0" w:line="280"/>
+        <w:ind w:left="360" w:right="360"/>
+      </w:pPr>
+      <w:r>
+        <w:rPr>
+          <w:rFonts w:ascii="SF Mono" w:cs="SF Mono" w:eastAsia="SF Mono" w:hAnsi="SF Mono"/>
+          <w:color w:val="333333"/>
+          <w:sz w:val="18"/>
+          <w:szCs w:val="18"/>
+        </w:rPr>
+        <w:t xml:space="preserve">  label: "铸锭",</w:t>
+      </w:r>
+    </w:p>
+    <w:p>
+      <w:pPr>
+        <w:shd w:fill="F5F4F0" w:val="clear"/>
+        <w:spacing w:after="0" w:line="280"/>
+        <w:ind w:left="360" w:right="360"/>
+      </w:pPr>
+      <w:r>
+        <w:rPr>
+          <w:rFonts w:ascii="SF Mono" w:cs="SF Mono" w:eastAsia="SF Mono" w:hAnsi="SF Mono"/>
+          <w:color w:val="333333"/>
+          <w:sz w:val="18"/>
+          <w:szCs w:val="18"/>
+        </w:rPr>
+        <w:t xml:space="preserve">  gloss: "立式半连续铸造产出的单根金属锭",</w:t>
+      </w:r>
+    </w:p>
+    <w:p>
+      <w:pPr>
+        <w:shd w:fill="F5F4F0" w:val="clear"/>
+        <w:spacing w:after="0" w:line="280"/>
+        <w:ind w:left="360" w:right="360"/>
+      </w:pPr>
+      <w:r>
+        <w:rPr>
+          <w:rFonts w:ascii="SF Mono" w:cs="SF Mono" w:eastAsia="SF Mono" w:hAnsi="SF Mono"/>
+          <w:color w:val="333333"/>
+          <w:sz w:val="18"/>
+          <w:szCs w:val="18"/>
+        </w:rPr>
+        <w:t xml:space="preserve">  basis: "工艺手册第 6.1 节"       // ← 必填：这个词的出处</w:t>
+      </w:r>
+    </w:p>
+    <w:p>
+      <w:pPr>
+        <w:shd w:fill="F5F4F0" w:val="clear"/>
+        <w:spacing w:after="0" w:line="280"/>
+        <w:ind w:left="360" w:right="360"/>
+      </w:pPr>
+      <w:r>
+        <w:rPr>
+          <w:rFonts w:ascii="SF Mono" w:cs="SF Mono" w:eastAsia="SF Mono" w:hAnsi="SF Mono"/>
+          <w:color w:val="333333"/>
+          <w:sz w:val="18"/>
+          <w:szCs w:val="18"/>
+        </w:rPr>
+        <w:t xml:space="preserve">})</w:t>
+      </w:r>
+    </w:p>
+    <w:p>
+      <w:pPr>
+        <w:shd w:fill="F5F4F0" w:val="clear"/>
+        <w:spacing w:after="0" w:line="280"/>
+        <w:ind w:left="360" w:right="360"/>
+      </w:pPr>
+      <w:r>
+        <w:rPr>
+          <w:rFonts w:ascii="SF Mono" w:cs="SF Mono" w:eastAsia="SF Mono" w:hAnsi="SF Mono"/>
+          <w:color w:val="333333"/>
+          <w:sz w:val="18"/>
+          <w:szCs w:val="18"/>
+        </w:rPr>
+        <w:t xml:space="preserve"/>
+      </w:r>
+    </w:p>
+    <w:p>
+      <w:pPr>
+        <w:shd w:fill="F5F4F0" w:val="clear"/>
+        <w:spacing w:after="0" w:line="280"/>
+        <w:ind w:left="360" w:right="360"/>
+      </w:pPr>
+      <w:r>
+        <w:rPr>
+          <w:rFonts w:ascii="SF Mono" w:cs="SF Mono" w:eastAsia="SF Mono" w:hAnsi="SF Mono"/>
+          <w:color w:val="333333"/>
+          <w:sz w:val="18"/>
+          <w:szCs w:val="18"/>
+        </w:rPr>
+        <w:t xml:space="preserve">RegisterPredicate({</w:t>
+      </w:r>
+    </w:p>
+    <w:p>
+      <w:pPr>
+        <w:shd w:fill="F5F4F0" w:val="clear"/>
+        <w:spacing w:after="0" w:line="280"/>
+        <w:ind w:left="360" w:right="360"/>
+      </w:pPr>
+      <w:r>
+        <w:rPr>
+          <w:rFonts w:ascii="SF Mono" w:cs="SF Mono" w:eastAsia="SF Mono" w:hAnsi="SF Mono"/>
+          <w:color w:val="333333"/>
+          <w:sz w:val="18"/>
+          <w:szCs w:val="18"/>
+        </w:rPr>
+        <w:t xml:space="preserve">  id: "oxygen_ppm",</w:t>
+      </w:r>
+    </w:p>
+    <w:p>
+      <w:pPr>
+        <w:shd w:fill="F5F4F0" w:val="clear"/>
+        <w:spacing w:after="0" w:line="280"/>
+        <w:ind w:left="360" w:right="360"/>
+      </w:pPr>
+      <w:r>
+        <w:rPr>
+          <w:rFonts w:ascii="SF Mono" w:cs="SF Mono" w:eastAsia="SF Mono" w:hAnsi="SF Mono"/>
+          <w:color w:val="333333"/>
+          <w:sz w:val="18"/>
+          <w:szCs w:val="18"/>
+        </w:rPr>
+        <w:t xml:space="preserve">  label: "氧含量检测值",</w:t>
+      </w:r>
+    </w:p>
+    <w:p>
+      <w:pPr>
+        <w:shd w:fill="F5F4F0" w:val="clear"/>
+        <w:spacing w:after="0" w:line="280"/>
+        <w:ind w:left="360" w:right="360"/>
+      </w:pPr>
+      <w:r>
+        <w:rPr>
+          <w:rFonts w:ascii="SF Mono" w:cs="SF Mono" w:eastAsia="SF Mono" w:hAnsi="SF Mono"/>
+          <w:color w:val="333333"/>
+          <w:sz w:val="18"/>
+          <w:szCs w:val="18"/>
+        </w:rPr>
+        <w:t xml:space="preserve">  domain: "ingot",                  // 主词域</w:t>
+      </w:r>
+    </w:p>
+    <w:p>
+      <w:pPr>
+        <w:shd w:fill="F5F4F0" w:val="clear"/>
+        <w:spacing w:after="0" w:line="280"/>
+        <w:ind w:left="360" w:right="360"/>
+      </w:pPr>
+      <w:r>
+        <w:rPr>
+          <w:rFonts w:ascii="SF Mono" w:cs="SF Mono" w:eastAsia="SF Mono" w:hAnsi="SF Mono"/>
+          <w:color w:val="333333"/>
+          <w:sz w:val="18"/>
+          <w:szCs w:val="18"/>
+        </w:rPr>
+        <w:t xml:space="preserve">  range: { form: "quantity", unit: "ppm" },</w:t>
+      </w:r>
+    </w:p>
+    <w:p>
+      <w:pPr>
+        <w:shd w:fill="F5F4F0" w:val="clear"/>
+        <w:spacing w:after="0" w:line="280"/>
+        <w:ind w:left="360" w:right="360"/>
+      </w:pPr>
+      <w:r>
+        <w:rPr>
+          <w:rFonts w:ascii="SF Mono" w:cs="SF Mono" w:eastAsia="SF Mono" w:hAnsi="SF Mono"/>
+          <w:color w:val="333333"/>
+          <w:sz w:val="18"/>
+          <w:szCs w:val="18"/>
+        </w:rPr>
+        <w:t xml:space="preserve">  functional: true,                 // ← 单值：同一铸锭只有一个读数</w:t>
+      </w:r>
+    </w:p>
+    <w:p>
+      <w:pPr>
+        <w:shd w:fill="F5F4F0" w:val="clear"/>
+        <w:spacing w:after="0" w:line="280"/>
+        <w:ind w:left="360" w:right="360"/>
+      </w:pPr>
+      <w:r>
+        <w:rPr>
+          <w:rFonts w:ascii="SF Mono" w:cs="SF Mono" w:eastAsia="SF Mono" w:hAnsi="SF Mono"/>
+          <w:color w:val="333333"/>
+          <w:sz w:val="18"/>
+          <w:szCs w:val="18"/>
+        </w:rPr>
+        <w:t xml:space="preserve">  basis: "ASTM E2575"</w:t>
+      </w:r>
+    </w:p>
+    <w:p>
+      <w:pPr>
+        <w:shd w:fill="F5F4F0" w:val="clear"/>
+        <w:spacing w:after="0" w:line="280"/>
+        <w:ind w:left="360" w:right="360"/>
+      </w:pPr>
+      <w:r>
+        <w:rPr>
+          <w:rFonts w:ascii="SF Mono" w:cs="SF Mono" w:eastAsia="SF Mono" w:hAnsi="SF Mono"/>
+          <w:color w:val="333333"/>
+          <w:sz w:val="18"/>
+          <w:szCs w:val="18"/>
+        </w:rPr>
+        <w:t xml:space="preserve">})</w:t>
+      </w:r>
+    </w:p>
+    <w:p>
+      <w:pPr>
+        <w:shd w:fill="F5F4F0" w:val="clear"/>
+        <w:spacing w:after="160"/>
+        <w:ind w:left="360" w:right="360"/>
+      </w:pPr>
+    </w:p>
+    <w:p>
+      <w:pPr>
+        <w:spacing w:after="160" w:line="340"/>
+      </w:pPr>
+      <w:r>
+        <w:rPr>
+          <w:rFonts w:ascii="PingFang SC" w:cs="PingFang SC" w:eastAsia="PingFang SC" w:hAnsi="PingFang SC"/>
+          <w:color w:val="1C1A18"/>
+          <w:sz w:val="22"/>
+          <w:szCs w:val="22"/>
+        </w:rPr>
+        <w:t xml:space="preserve">注意 </w:t>
+      </w:r>
+      <w:r>
+        <w:rPr>
+          <w:rFonts w:ascii="PingFang SC" w:cs="PingFang SC" w:eastAsia="PingFang SC" w:hAnsi="PingFang SC"/>
+          <w:b/>
+          <w:bCs/>
+          <w:color w:val="2E75B6"/>
+          <w:sz w:val="22"/>
+          <w:szCs w:val="22"/>
+        </w:rPr>
+        <w:t xml:space="preserve">functional: true</w:t>
+      </w:r>
+      <w:r>
+        <w:rPr>
+          <w:rFonts w:ascii="PingFang SC" w:cs="PingFang SC" w:eastAsia="PingFang SC" w:hAnsi="PingFang SC"/>
+          <w:color w:val="1C1A18"/>
+          <w:sz w:val="22"/>
+          <w:szCs w:val="22"/>
+        </w:rPr>
+        <w:t xml:space="preserve">。这是本体工程里的经典约束（描述逻辑里叫 functional property）：</w:t>
+      </w:r>
+      <w:r>
+        <w:rPr>
+          <w:rFonts w:ascii="PingFang SC" w:cs="PingFang SC" w:eastAsia="PingFang SC" w:hAnsi="PingFang SC"/>
+          <w:b/>
+          <w:bCs/>
+          <w:color w:val="1C1A18"/>
+          <w:sz w:val="22"/>
+          <w:szCs w:val="22"/>
+        </w:rPr>
+        <w:t xml:space="preserve">同一主体只能有一个取值</w:t>
+      </w:r>
+      <w:r>
+        <w:rPr>
+          <w:rFonts w:ascii="PingFang SC" w:cs="PingFang SC" w:eastAsia="PingFang SC" w:hAnsi="PingFang SC"/>
+          <w:color w:val="1C1A18"/>
+          <w:sz w:val="22"/>
+          <w:szCs w:val="22"/>
+        </w:rPr>
+        <w:t xml:space="preserve">。它的作用马上会看到——冲突检测靠它。</w:t>
+      </w:r>
+    </w:p>
+    <w:p>
+      <w:pPr>
+        <w:spacing w:after="160" w:line="340"/>
+      </w:pPr>
+      <w:r>
+        <w:rPr>
+          <w:rFonts w:ascii="PingFang SC" w:cs="PingFang SC" w:eastAsia="PingFang SC" w:hAnsi="PingFang SC"/>
+          <w:color w:val="1C1A18"/>
+          <w:sz w:val="22"/>
+          <w:szCs w:val="22"/>
+        </w:rPr>
+        <w:t xml:space="preserve">每条词汇带 basis 登记。没有依据不收。修订留版本（旧值不删）。废止写原因（黏性废止，没有删除操作）。语义变化必须换 id。</w:t>
+      </w:r>
+    </w:p>
+    <w:p>
+      <w:pPr>
+        <w:spacing w:after="160" w:line="340"/>
+      </w:pPr>
+      <w:r>
+        <w:rPr>
+          <w:rFonts w:ascii="PingFang SC" w:cs="PingFang SC" w:eastAsia="PingFang SC" w:hAnsi="PingFang SC"/>
+          <w:color w:val="1C1A18"/>
+          <w:sz w:val="22"/>
+          <w:szCs w:val="22"/>
+        </w:rPr>
+        <w:t xml:space="preserve">这是本体工程的底线：</w:t>
+      </w:r>
+      <w:r>
+        <w:rPr>
+          <w:rFonts w:ascii="PingFang SC" w:cs="PingFang SC" w:eastAsia="PingFang SC" w:hAnsi="PingFang SC"/>
+          <w:b/>
+          <w:bCs/>
+          <w:color w:val="1C1A18"/>
+          <w:sz w:val="22"/>
+          <w:szCs w:val="22"/>
+        </w:rPr>
+        <w:t xml:space="preserve">如果一个词的含义可以随时变，建立在它之上的所有断言都是沙上城堡。</w:t>
+      </w:r>
+    </w:p>
+    <w:p>
+      <w:pPr>
+        <w:pStyle w:val="Heading3"/>
+        <w:spacing w:after="140" w:before="300"/>
+      </w:pPr>
+      <w:r>
+        <w:rPr>
+          <w:rFonts w:ascii="PingFang SC" w:cs="PingFang SC" w:eastAsia="PingFang SC" w:hAnsi="PingFang SC"/>
+          <w:b/>
+          <w:bCs/>
+          <w:color w:val="1C1A18"/>
+          <w:sz w:val="25"/>
+          <w:szCs w:val="25"/>
+        </w:rPr>
+        <w:t xml:space="preserve">类型化断言</w:t>
+      </w:r>
+    </w:p>
+    <w:p>
+      <w:pPr>
+        <w:shd w:fill="F5F4F0" w:val="clear"/>
+        <w:spacing w:after="60"/>
+        <w:ind w:left="360" w:right="360"/>
+      </w:pPr>
+    </w:p>
+    <w:p>
+      <w:pPr>
+        <w:shd w:fill="F5F4F0" w:val="clear"/>
+        <w:spacing w:after="0" w:line="280"/>
+        <w:ind w:left="360" w:right="360"/>
+      </w:pPr>
+      <w:r>
+        <w:rPr>
+          <w:rFonts w:ascii="SF Mono" w:cs="SF Mono" w:eastAsia="SF Mono" w:hAnsi="SF Mono"/>
+          <w:color w:val="333333"/>
+          <w:sz w:val="18"/>
+          <w:szCs w:val="18"/>
+        </w:rPr>
+        <w:t xml:space="preserve">{</w:t>
+      </w:r>
+    </w:p>
+    <w:p>
+      <w:pPr>
+        <w:shd w:fill="F5F4F0" w:val="clear"/>
+        <w:spacing w:after="0" w:line="280"/>
+        <w:ind w:left="360" w:right="360"/>
+      </w:pPr>
+      <w:r>
+        <w:rPr>
+          <w:rFonts w:ascii="SF Mono" w:cs="SF Mono" w:eastAsia="SF Mono" w:hAnsi="SF Mono"/>
+          <w:color w:val="333333"/>
+          <w:sz w:val="18"/>
+          <w:szCs w:val="18"/>
+        </w:rPr>
+        <w:t xml:space="preserve">  predicate: "oxygen_ppm",</w:t>
+      </w:r>
+    </w:p>
+    <w:p>
+      <w:pPr>
+        <w:shd w:fill="F5F4F0" w:val="clear"/>
+        <w:spacing w:after="0" w:line="280"/>
+        <w:ind w:left="360" w:right="360"/>
+      </w:pPr>
+      <w:r>
+        <w:rPr>
+          <w:rFonts w:ascii="SF Mono" w:cs="SF Mono" w:eastAsia="SF Mono" w:hAnsi="SF Mono"/>
+          <w:color w:val="333333"/>
+          <w:sz w:val="18"/>
+          <w:szCs w:val="18"/>
+        </w:rPr>
+        <w:t xml:space="preserve">  subject:   { id: "INGOT-3", type: "ingot" },</w:t>
+      </w:r>
+    </w:p>
+    <w:p>
+      <w:pPr>
+        <w:shd w:fill="F5F4F0" w:val="clear"/>
+        <w:spacing w:after="0" w:line="280"/>
+        <w:ind w:left="360" w:right="360"/>
+      </w:pPr>
+      <w:r>
+        <w:rPr>
+          <w:rFonts w:ascii="SF Mono" w:cs="SF Mono" w:eastAsia="SF Mono" w:hAnsi="SF Mono"/>
+          <w:color w:val="333333"/>
+          <w:sz w:val="18"/>
+          <w:szCs w:val="18"/>
+        </w:rPr>
+        <w:t xml:space="preserve">  object:    { kind: "quantity", value: 10, unit: "ppm" }</w:t>
+      </w:r>
+    </w:p>
+    <w:p>
+      <w:pPr>
+        <w:shd w:fill="F5F4F0" w:val="clear"/>
+        <w:spacing w:after="0" w:line="280"/>
+        <w:ind w:left="360" w:right="360"/>
+      </w:pPr>
+      <w:r>
+        <w:rPr>
+          <w:rFonts w:ascii="SF Mono" w:cs="SF Mono" w:eastAsia="SF Mono" w:hAnsi="SF Mono"/>
+          <w:color w:val="333333"/>
+          <w:sz w:val="18"/>
+          <w:szCs w:val="18"/>
+        </w:rPr>
+        <w:t xml:space="preserve">}</w:t>
+      </w:r>
+    </w:p>
+    <w:p>
+      <w:pPr>
+        <w:shd w:fill="F5F4F0" w:val="clear"/>
+        <w:spacing w:after="160"/>
+        <w:ind w:left="360" w:right="360"/>
+      </w:pPr>
+    </w:p>
+    <w:p>
+      <w:pPr>
+        <w:spacing w:after="160" w:line="340"/>
+      </w:pPr>
+      <w:r>
+        <w:rPr>
+          <w:rFonts w:ascii="PingFang SC" w:cs="PingFang SC" w:eastAsia="PingFang SC" w:hAnsi="PingFang SC"/>
+          <w:color w:val="1C1A18"/>
+          <w:sz w:val="22"/>
+          <w:szCs w:val="22"/>
+        </w:rPr>
+        <w:t xml:space="preserve">值形态有五种，每种有明确的工程语义：</w:t>
+      </w:r>
+    </w:p>
+    <w:tbl>
+      <w:tblPr>
+        <w:tblW w:type="dxa" w:w="9936"/>
+        <w:tblBorders>
+          <w:top w:val="single" w:color="auto" w:sz="4"/>
+          <w:left w:val="single" w:color="auto" w:sz="4"/>
+          <w:bottom w:val="single" w:color="auto" w:sz="4"/>
+          <w:right w:val="single" w:color="auto" w:sz="4"/>
+          <w:insideH w:val="single" w:color="auto" w:sz="4"/>
+          <w:insideV w:val="single" w:color="auto" w:sz="4"/>
+        </w:tblBorders>
+      </w:tblPr>
+      <w:tblGrid>
+        <w:gridCol w:w="1800"/>
+        <w:gridCol w:w="3600"/>
+        <w:gridCol w:w="4536"/>
+      </w:tblGrid>
+      <w:tr>
+        <w:tc>
+          <w:tcPr>
+            <w:tcW w:type="dxa" w:w="1800"/>
+            <w:tcBorders>
+              <w:top w:val="single" w:color="DDD9D3" w:sz="1"/>
+              <w:left w:val="single" w:color="DDD9D3" w:sz="1"/>
+              <w:bottom w:val="single" w:color="DDD9D3" w:sz="1"/>
+              <w:right w:val="single" w:color="DDD9D3" w:sz="1"/>
+            </w:tcBorders>
+            <w:shd w:fill="EAF1F8" w:val="clear"/>
+            <w:tcMar>
+              <w:top w:type="dxa" w:w="60"/>
+              <w:left w:type="dxa" w:w="100"/>
+              <w:bottom w:type="dxa" w:w="60"/>
+              <w:right w:type="dxa" w:w="100"/>
+            </w:tcMar>
+          </w:tcPr>
+          <w:p>
+            <w:r>
+              <w:rPr>
+                <w:rFonts w:ascii="PingFang SC" w:cs="PingFang SC" w:eastAsia="PingFang SC" w:hAnsi="PingFang SC"/>
+                <w:b/>
+                <w:bCs/>
+                <w:color w:val="1C1A18"/>
+                <w:sz w:val="22"/>
+                <w:szCs w:val="22"/>
+              </w:rPr>
+              <w:t xml:space="preserve">形态</w:t>
+            </w:r>
+          </w:p>
+        </w:tc>
+        <w:tc>
+          <w:tcPr>
+            <w:tcW w:type="dxa" w:w="3600"/>
+            <w:tcBorders>
+              <w:top w:val="single" w:color="DDD9D3" w:sz="1"/>
+              <w:left w:val="single" w:color="DDD9D3" w:sz="1"/>
+              <w:bottom w:val="single" w:color="DDD9D3" w:sz="1"/>
+              <w:right w:val="single" w:color="DDD9D3" w:sz="1"/>
+            </w:tcBorders>
+            <w:shd w:fill="EAF1F8" w:val="clear"/>
+            <w:tcMar>
+              <w:top w:type="dxa" w:w="60"/>
+              <w:left w:type="dxa" w:w="100"/>
+              <w:bottom w:type="dxa" w:w="60"/>
+              <w:right w:type="dxa" w:w="100"/>
+            </w:tcMar>
+          </w:tcPr>
+          <w:p>
+            <w:r>
+              <w:rPr>
+                <w:rFonts w:ascii="PingFang SC" w:cs="PingFang SC" w:eastAsia="PingFang SC" w:hAnsi="PingFang SC"/>
+                <w:b/>
+                <w:bCs/>
+                <w:color w:val="1C1A18"/>
+                <w:sz w:val="22"/>
+                <w:szCs w:val="22"/>
+              </w:rPr>
+              <w:t xml:space="preserve">含义</w:t>
+            </w:r>
+          </w:p>
+        </w:tc>
+        <w:tc>
+          <w:tcPr>
+            <w:tcW w:type="dxa" w:w="4536"/>
+            <w:tcBorders>
+              <w:top w:val="single" w:color="DDD9D3" w:sz="1"/>
+              <w:left w:val="single" w:color="DDD9D3" w:sz="1"/>
+              <w:bottom w:val="single" w:color="DDD9D3" w:sz="1"/>
+              <w:right w:val="single" w:color="DDD9D3" w:sz="1"/>
+            </w:tcBorders>
+            <w:shd w:fill="EAF1F8" w:val="clear"/>
+            <w:tcMar>
+              <w:top w:type="dxa" w:w="60"/>
+              <w:left w:type="dxa" w:w="100"/>
+              <w:bottom w:type="dxa" w:w="60"/>
+              <w:right w:type="dxa" w:w="100"/>
+            </w:tcMar>
+          </w:tcPr>
+          <w:p>
+            <w:r>
+              <w:rPr>
+                <w:rFonts w:ascii="PingFang SC" w:cs="PingFang SC" w:eastAsia="PingFang SC" w:hAnsi="PingFang SC"/>
+                <w:b/>
+                <w:bCs/>
+                <w:color w:val="1C1A18"/>
+                <w:sz w:val="22"/>
+                <w:szCs w:val="22"/>
+              </w:rPr>
+              <w:t xml:space="preserve">工程价值</w:t>
+            </w:r>
+          </w:p>
+        </w:tc>
+      </w:tr>
+      <w:tr>
+        <w:tc>
+          <w:tcPr>
+            <w:tcW w:type="dxa" w:w="1800"/>
+            <w:tcBorders>
+              <w:top w:val="single" w:color="DDD9D3" w:sz="1"/>
+              <w:left w:val="single" w:color="DDD9D3" w:sz="1"/>
+              <w:bottom w:val="single" w:color="DDD9D3" w:sz="1"/>
+              <w:right w:val="single" w:color="DDD9D3" w:sz="1"/>
+            </w:tcBorders>
+            <w:tcMar>
+              <w:top w:type="dxa" w:w="60"/>
+              <w:left w:type="dxa" w:w="100"/>
+              <w:bottom w:type="dxa" w:w="60"/>
+              <w:right w:type="dxa" w:w="100"/>
+            </w:tcMar>
+          </w:tcPr>
+          <w:p>
+            <w:r>
+              <w:rPr>
+                <w:rFonts w:ascii="PingFang SC" w:cs="PingFang SC" w:eastAsia="PingFang SC" w:hAnsi="PingFang SC"/>
+                <w:color w:val="1C1A18"/>
+                <w:sz w:val="22"/>
+                <w:szCs w:val="22"/>
+              </w:rPr>
+              <w:t xml:space="preserve">statement</w:t>
+            </w:r>
+          </w:p>
+        </w:tc>
+        <w:tc>
+          <w:tcPr>
+            <w:tcW w:type="dxa" w:w="3600"/>
+            <w:tcBorders>
+              <w:top w:val="single" w:color="DDD9D3" w:sz="1"/>
+              <w:left w:val="single" w:color="DDD9D3" w:sz="1"/>
+              <w:bottom w:val="single" w:color="DDD9D3" w:sz="1"/>
+              <w:right w:val="single" w:color="DDD9D3" w:sz="1"/>
+            </w:tcBorders>
+            <w:tcMar>
+              <w:top w:type="dxa" w:w="60"/>
+              <w:left w:type="dxa" w:w="100"/>
+              <w:bottom w:type="dxa" w:w="60"/>
+              <w:right w:type="dxa" w:w="100"/>
+            </w:tcMar>
+          </w:tcPr>
+          <w:p>
+            <w:r>
+              <w:rPr>
+                <w:rFonts w:ascii="PingFang SC" w:cs="PingFang SC" w:eastAsia="PingFang SC" w:hAnsi="PingFang SC"/>
+                <w:color w:val="1C1A18"/>
+                <w:sz w:val="22"/>
+                <w:szCs w:val="22"/>
+              </w:rPr>
+              <w:t xml:space="preserve">一句可验证的陈述</w:t>
+            </w:r>
+          </w:p>
+        </w:tc>
+        <w:tc>
+          <w:tcPr>
+            <w:tcW w:type="dxa" w:w="4536"/>
+            <w:tcBorders>
+              <w:top w:val="single" w:color="DDD9D3" w:sz="1"/>
+              <w:left w:val="single" w:color="DDD9D3" w:sz="1"/>
+              <w:bottom w:val="single" w:color="DDD9D3" w:sz="1"/>
+              <w:right w:val="single" w:color="DDD9D3" w:sz="1"/>
+            </w:tcBorders>
+            <w:tcMar>
+              <w:top w:type="dxa" w:w="60"/>
+              <w:left w:type="dxa" w:w="100"/>
+              <w:bottom w:type="dxa" w:w="60"/>
+              <w:right w:type="dxa" w:w="100"/>
+            </w:tcMar>
+          </w:tcPr>
+          <w:p>
+            <w:r>
+              <w:rPr>
+                <w:rFonts w:ascii="PingFang SC" w:cs="PingFang SC" w:eastAsia="PingFang SC" w:hAnsi="PingFang SC"/>
+                <w:color w:val="1C1A18"/>
+                <w:sz w:val="22"/>
+                <w:szCs w:val="22"/>
+              </w:rPr>
+              <w:t xml:space="preserve">最低门槛的结构化</w:t>
+            </w:r>
+          </w:p>
+        </w:tc>
+      </w:tr>
+      <w:tr>
+        <w:tc>
+          <w:tcPr>
+            <w:tcW w:type="dxa" w:w="1800"/>
+            <w:tcBorders>
+              <w:top w:val="single" w:color="DDD9D3" w:sz="1"/>
+              <w:left w:val="single" w:color="DDD9D3" w:sz="1"/>
+              <w:bottom w:val="single" w:color="DDD9D3" w:sz="1"/>
+              <w:right w:val="single" w:color="DDD9D3" w:sz="1"/>
+            </w:tcBorders>
+            <w:tcMar>
+              <w:top w:type="dxa" w:w="60"/>
+              <w:left w:type="dxa" w:w="100"/>
+              <w:bottom w:type="dxa" w:w="60"/>
+              <w:right w:type="dxa" w:w="100"/>
+            </w:tcMar>
+          </w:tcPr>
+          <w:p>
+            <w:r>
+              <w:rPr>
+                <w:rFonts w:ascii="PingFang SC" w:cs="PingFang SC" w:eastAsia="PingFang SC" w:hAnsi="PingFang SC"/>
+                <w:color w:val="1C1A18"/>
+                <w:sz w:val="22"/>
+                <w:szCs w:val="22"/>
+              </w:rPr>
+              <w:t xml:space="preserve">quantity</w:t>
+            </w:r>
+          </w:p>
+        </w:tc>
+        <w:tc>
+          <w:tcPr>
+            <w:tcW w:type="dxa" w:w="3600"/>
+            <w:tcBorders>
+              <w:top w:val="single" w:color="DDD9D3" w:sz="1"/>
+              <w:left w:val="single" w:color="DDD9D3" w:sz="1"/>
+              <w:bottom w:val="single" w:color="DDD9D3" w:sz="1"/>
+              <w:right w:val="single" w:color="DDD9D3" w:sz="1"/>
+            </w:tcBorders>
+            <w:tcMar>
+              <w:top w:type="dxa" w:w="60"/>
+              <w:left w:type="dxa" w:w="100"/>
+              <w:bottom w:type="dxa" w:w="60"/>
+              <w:right w:type="dxa" w:w="100"/>
+            </w:tcMar>
+          </w:tcPr>
+          <w:p>
+            <w:r>
+              <w:rPr>
+                <w:rFonts w:ascii="PingFang SC" w:cs="PingFang SC" w:eastAsia="PingFang SC" w:hAnsi="PingFang SC"/>
+                <w:color w:val="1C1A18"/>
+                <w:sz w:val="22"/>
+                <w:szCs w:val="22"/>
+              </w:rPr>
+              <w:t xml:space="preserve">数值 + 单位</w:t>
+            </w:r>
+          </w:p>
+        </w:tc>
+        <w:tc>
+          <w:tcPr>
+            <w:tcW w:type="dxa" w:w="4536"/>
+            <w:tcBorders>
+              <w:top w:val="single" w:color="DDD9D3" w:sz="1"/>
+              <w:left w:val="single" w:color="DDD9D3" w:sz="1"/>
+              <w:bottom w:val="single" w:color="DDD9D3" w:sz="1"/>
+              <w:right w:val="single" w:color="DDD9D3" w:sz="1"/>
+            </w:tcBorders>
+            <w:tcMar>
+              <w:top w:type="dxa" w:w="60"/>
+              <w:left w:type="dxa" w:w="100"/>
+              <w:bottom w:type="dxa" w:w="60"/>
+              <w:right w:type="dxa" w:w="100"/>
+            </w:tcMar>
+          </w:tcPr>
+          <w:p>
+            <w:r>
+              <w:rPr>
+                <w:rFonts w:ascii="PingFang SC" w:cs="PingFang SC" w:eastAsia="PingFang SC" w:hAnsi="PingFang SC"/>
+                <w:color w:val="1C1A18"/>
+                <w:sz w:val="22"/>
+                <w:szCs w:val="22"/>
+              </w:rPr>
+              <w:t xml:space="preserve">可比较、可检冲突</w:t>
+            </w:r>
+          </w:p>
+        </w:tc>
+      </w:tr>
+      <w:tr>
+        <w:tc>
+          <w:tcPr>
+            <w:tcW w:type="dxa" w:w="1800"/>
+            <w:tcBorders>
+              <w:top w:val="single" w:color="DDD9D3" w:sz="1"/>
+              <w:left w:val="single" w:color="DDD9D3" w:sz="1"/>
+              <w:bottom w:val="single" w:color="DDD9D3" w:sz="1"/>
+              <w:right w:val="single" w:color="DDD9D3" w:sz="1"/>
+            </w:tcBorders>
+            <w:tcMar>
+              <w:top w:type="dxa" w:w="60"/>
+              <w:left w:type="dxa" w:w="100"/>
+              <w:bottom w:type="dxa" w:w="60"/>
+              <w:right w:type="dxa" w:w="100"/>
+            </w:tcMar>
+          </w:tcPr>
+          <w:p>
+            <w:r>
+              <w:rPr>
+                <w:rFonts w:ascii="PingFang SC" w:cs="PingFang SC" w:eastAsia="PingFang SC" w:hAnsi="PingFang SC"/>
+                <w:color w:val="1C1A18"/>
+                <w:sz w:val="22"/>
+                <w:szCs w:val="22"/>
+              </w:rPr>
+              <w:t xml:space="preserve">formula</w:t>
+            </w:r>
+          </w:p>
+        </w:tc>
+        <w:tc>
+          <w:tcPr>
+            <w:tcW w:type="dxa" w:w="3600"/>
+            <w:tcBorders>
+              <w:top w:val="single" w:color="DDD9D3" w:sz="1"/>
+              <w:left w:val="single" w:color="DDD9D3" w:sz="1"/>
+              <w:bottom w:val="single" w:color="DDD9D3" w:sz="1"/>
+              <w:right w:val="single" w:color="DDD9D3" w:sz="1"/>
+            </w:tcBorders>
+            <w:tcMar>
+              <w:top w:type="dxa" w:w="60"/>
+              <w:left w:type="dxa" w:w="100"/>
+              <w:bottom w:type="dxa" w:w="60"/>
+              <w:right w:type="dxa" w:w="100"/>
+            </w:tcMar>
+          </w:tcPr>
+          <w:p>
+            <w:r>
+              <w:rPr>
+                <w:rFonts w:ascii="PingFang SC" w:cs="PingFang SC" w:eastAsia="PingFang SC" w:hAnsi="PingFang SC"/>
+                <w:color w:val="1C1A18"/>
+                <w:sz w:val="22"/>
+                <w:szCs w:val="22"/>
+              </w:rPr>
+              <w:t xml:space="preserve">指向可重跑的公式文件</w:t>
+            </w:r>
+          </w:p>
+        </w:tc>
+        <w:tc>
+          <w:tcPr>
+            <w:tcW w:type="dxa" w:w="4536"/>
+            <w:tcBorders>
+              <w:top w:val="single" w:color="DDD9D3" w:sz="1"/>
+              <w:left w:val="single" w:color="DDD9D3" w:sz="1"/>
+              <w:bottom w:val="single" w:color="DDD9D3" w:sz="1"/>
+              <w:right w:val="single" w:color="DDD9D3" w:sz="1"/>
+            </w:tcBorders>
+            <w:tcMar>
+              <w:top w:type="dxa" w:w="60"/>
+              <w:left w:type="dxa" w:w="100"/>
+              <w:bottom w:type="dxa" w:w="60"/>
+              <w:right w:type="dxa" w:w="100"/>
+            </w:tcMar>
+          </w:tcPr>
+          <w:p>
+            <w:r>
+              <w:rPr>
+                <w:rFonts w:ascii="PingFang SC" w:cs="PingFang SC" w:eastAsia="PingFang SC" w:hAnsi="PingFang SC"/>
+                <w:color w:val="1C1A18"/>
+                <w:sz w:val="22"/>
+                <w:szCs w:val="22"/>
+              </w:rPr>
+              <w:t xml:space="preserve">可复现</w:t>
+            </w:r>
+          </w:p>
+        </w:tc>
+      </w:tr>
+      <w:tr>
+        <w:tc>
+          <w:tcPr>
+            <w:tcW w:type="dxa" w:w="1800"/>
+            <w:tcBorders>
+              <w:top w:val="single" w:color="DDD9D3" w:sz="1"/>
+              <w:left w:val="single" w:color="DDD9D3" w:sz="1"/>
+              <w:bottom w:val="single" w:color="DDD9D3" w:sz="1"/>
+              <w:right w:val="single" w:color="DDD9D3" w:sz="1"/>
+            </w:tcBorders>
+            <w:tcMar>
+              <w:top w:type="dxa" w:w="60"/>
+              <w:left w:type="dxa" w:w="100"/>
+              <w:bottom w:type="dxa" w:w="60"/>
+              <w:right w:type="dxa" w:w="100"/>
+            </w:tcMar>
+          </w:tcPr>
+          <w:p>
+            <w:r>
+              <w:rPr>
+                <w:rFonts w:ascii="PingFang SC" w:cs="PingFang SC" w:eastAsia="PingFang SC" w:hAnsi="PingFang SC"/>
+                <w:color w:val="1C1A18"/>
+                <w:sz w:val="22"/>
+                <w:szCs w:val="22"/>
+              </w:rPr>
+              <w:t xml:space="preserve">code</w:t>
+            </w:r>
+          </w:p>
+        </w:tc>
+        <w:tc>
+          <w:tcPr>
+            <w:tcW w:type="dxa" w:w="3600"/>
+            <w:tcBorders>
+              <w:top w:val="single" w:color="DDD9D3" w:sz="1"/>
+              <w:left w:val="single" w:color="DDD9D3" w:sz="1"/>
+              <w:bottom w:val="single" w:color="DDD9D3" w:sz="1"/>
+              <w:right w:val="single" w:color="DDD9D3" w:sz="1"/>
+            </w:tcBorders>
+            <w:tcMar>
+              <w:top w:type="dxa" w:w="60"/>
+              <w:left w:type="dxa" w:w="100"/>
+              <w:bottom w:type="dxa" w:w="60"/>
+              <w:right w:type="dxa" w:w="100"/>
+            </w:tcMar>
+          </w:tcPr>
+          <w:p>
+            <w:r>
+              <w:rPr>
+                <w:rFonts w:ascii="PingFang SC" w:cs="PingFang SC" w:eastAsia="PingFang SC" w:hAnsi="PingFang SC"/>
+                <w:color w:val="1C1A18"/>
+                <w:sz w:val="22"/>
+                <w:szCs w:val="22"/>
+              </w:rPr>
+              <w:t xml:space="preserve">指向可执行的代码</w:t>
+            </w:r>
+          </w:p>
+        </w:tc>
+        <w:tc>
+          <w:tcPr>
+            <w:tcW w:type="dxa" w:w="4536"/>
+            <w:tcBorders>
+              <w:top w:val="single" w:color="DDD9D3" w:sz="1"/>
+              <w:left w:val="single" w:color="DDD9D3" w:sz="1"/>
+              <w:bottom w:val="single" w:color="DDD9D3" w:sz="1"/>
+              <w:right w:val="single" w:color="DDD9D3" w:sz="1"/>
+            </w:tcBorders>
+            <w:tcMar>
+              <w:top w:type="dxa" w:w="60"/>
+              <w:left w:type="dxa" w:w="100"/>
+              <w:bottom w:type="dxa" w:w="60"/>
+              <w:right w:type="dxa" w:w="100"/>
+            </w:tcMar>
+          </w:tcPr>
+          <w:p>
+            <w:r>
+              <w:rPr>
+                <w:rFonts w:ascii="PingFang SC" w:cs="PingFang SC" w:eastAsia="PingFang SC" w:hAnsi="PingFang SC"/>
+                <w:color w:val="1C1A18"/>
+                <w:sz w:val="22"/>
+                <w:szCs w:val="22"/>
+              </w:rPr>
+              <w:t xml:space="preserve">可执行验证</w:t>
+            </w:r>
+          </w:p>
+        </w:tc>
+      </w:tr>
+      <w:tr>
+        <w:tc>
+          <w:tcPr>
+            <w:tcW w:type="dxa" w:w="1800"/>
+            <w:tcBorders>
+              <w:top w:val="single" w:color="DDD9D3" w:sz="1"/>
+              <w:left w:val="single" w:color="DDD9D3" w:sz="1"/>
+              <w:bottom w:val="single" w:color="DDD9D3" w:sz="1"/>
+              <w:right w:val="single" w:color="DDD9D3" w:sz="1"/>
+            </w:tcBorders>
+            <w:tcMar>
+              <w:top w:type="dxa" w:w="60"/>
+              <w:left w:type="dxa" w:w="100"/>
+              <w:bottom w:type="dxa" w:w="60"/>
+              <w:right w:type="dxa" w:w="100"/>
+            </w:tcMar>
+          </w:tcPr>
+          <w:p>
+            <w:r>
+              <w:rPr>
+                <w:rFonts w:ascii="PingFang SC" w:cs="PingFang SC" w:eastAsia="PingFang SC" w:hAnsi="PingFang SC"/>
+                <w:color w:val="1C1A18"/>
+                <w:sz w:val="22"/>
+                <w:szCs w:val="22"/>
+              </w:rPr>
+              <w:t xml:space="preserve">reference</w:t>
+            </w:r>
+          </w:p>
+        </w:tc>
+        <w:tc>
+          <w:tcPr>
+            <w:tcW w:type="dxa" w:w="3600"/>
+            <w:tcBorders>
+              <w:top w:val="single" w:color="DDD9D3" w:sz="1"/>
+              <w:left w:val="single" w:color="DDD9D3" w:sz="1"/>
+              <w:bottom w:val="single" w:color="DDD9D3" w:sz="1"/>
+              <w:right w:val="single" w:color="DDD9D3" w:sz="1"/>
+            </w:tcBorders>
+            <w:tcMar>
+              <w:top w:type="dxa" w:w="60"/>
+              <w:left w:type="dxa" w:w="100"/>
+              <w:bottom w:type="dxa" w:w="60"/>
+              <w:right w:type="dxa" w:w="100"/>
+            </w:tcMar>
+          </w:tcPr>
+          <w:p>
+            <w:r>
+              <w:rPr>
+                <w:rFonts w:ascii="PingFang SC" w:cs="PingFang SC" w:eastAsia="PingFang SC" w:hAnsi="PingFang SC"/>
+                <w:color w:val="1C1A18"/>
+                <w:sz w:val="22"/>
+                <w:szCs w:val="22"/>
+              </w:rPr>
+              <w:t xml:space="preserve">指向外部来源（DOI / 标准号）</w:t>
+            </w:r>
+          </w:p>
+        </w:tc>
+        <w:tc>
+          <w:tcPr>
+            <w:tcW w:type="dxa" w:w="4536"/>
+            <w:tcBorders>
+              <w:top w:val="single" w:color="DDD9D3" w:sz="1"/>
+              <w:left w:val="single" w:color="DDD9D3" w:sz="1"/>
+              <w:bottom w:val="single" w:color="DDD9D3" w:sz="1"/>
+              <w:right w:val="single" w:color="DDD9D3" w:sz="1"/>
+            </w:tcBorders>
+            <w:tcMar>
+              <w:top w:type="dxa" w:w="60"/>
+              <w:left w:type="dxa" w:w="100"/>
+              <w:bottom w:type="dxa" w:w="60"/>
+              <w:right w:type="dxa" w:w="100"/>
+            </w:tcMar>
+          </w:tcPr>
+          <w:p>
+            <w:r>
+              <w:rPr>
+                <w:rFonts w:ascii="PingFang SC" w:cs="PingFang SC" w:eastAsia="PingFang SC" w:hAnsi="PingFang SC"/>
+                <w:color w:val="1C1A18"/>
+                <w:sz w:val="22"/>
+                <w:szCs w:val="22"/>
+              </w:rPr>
+              <w:t xml:space="preserve">可追溯</w:t>
+            </w:r>
+          </w:p>
+        </w:tc>
+      </w:tr>
+    </w:tbl>
+    <w:p>
+      <w:pPr>
+        <w:spacing w:after="160" w:line="340"/>
+      </w:pPr>
+      <w:r>
+        <w:rPr>
+          <w:rFonts w:ascii="PingFang SC" w:cs="PingFang SC" w:eastAsia="PingFang SC" w:hAnsi="PingFang SC"/>
+          <w:color w:val="1C1A18"/>
+          <w:sz w:val="22"/>
+          <w:szCs w:val="22"/>
+        </w:rPr>
+        <w:t xml:space="preserve"/>
+      </w:r>
+    </w:p>
+    <w:p>
+      <w:pPr>
+        <w:pStyle w:val="Heading3"/>
+        <w:spacing w:after="140" w:before="300"/>
+      </w:pPr>
+      <w:r>
+        <w:rPr>
+          <w:rFonts w:ascii="PingFang SC" w:cs="PingFang SC" w:eastAsia="PingFang SC" w:hAnsi="PingFang SC"/>
+          <w:b/>
+          <w:bCs/>
+          <w:color w:val="1C1A18"/>
+          <w:sz w:val="25"/>
+          <w:szCs w:val="25"/>
+        </w:rPr>
+        <w:t xml:space="preserve">两张图</w:t>
+      </w:r>
+    </w:p>
+    <w:p>
+      <w:pPr>
+        <w:spacing w:after="160" w:line="340"/>
+      </w:pPr>
+      <w:r>
+        <w:rPr>
+          <w:rFonts w:ascii="PingFang SC" w:cs="PingFang SC" w:eastAsia="PingFang SC" w:hAnsi="PingFang SC"/>
+          <w:b/>
+          <w:bCs/>
+          <w:color w:val="1C1A18"/>
+          <w:sz w:val="22"/>
+          <w:szCs w:val="22"/>
+        </w:rPr>
+        <w:t xml:space="preserve">本体图</w:t>
+      </w:r>
+      <w:r>
+        <w:rPr>
+          <w:rFonts w:ascii="PingFang SC" w:cs="PingFang SC" w:eastAsia="PingFang SC" w:hAnsi="PingFang SC"/>
+          <w:color w:val="1C1A18"/>
+          <w:sz w:val="22"/>
+          <w:szCs w:val="22"/>
+        </w:rPr>
+        <w:t xml:space="preserve">：概念是节点，is_a 和谓词是边。回答"这个领域允许表达什么"。它可以在零事实的状态下存在——先立词，再提假设。语言先于句子。</w:t>
+      </w:r>
+    </w:p>
+    <w:p>
+      <w:pPr>
+        <w:spacing w:after="160" w:line="340"/>
+      </w:pPr>
+      <w:r>
+        <w:rPr>
+          <w:rFonts w:ascii="PingFang SC" w:cs="PingFang SC" w:eastAsia="PingFang SC" w:hAnsi="PingFang SC"/>
+          <w:b/>
+          <w:bCs/>
+          <w:color w:val="1C1A18"/>
+          <w:sz w:val="22"/>
+          <w:szCs w:val="22"/>
+        </w:rPr>
+        <w:t xml:space="preserve">实体图</w:t>
+      </w:r>
+      <w:r>
+        <w:rPr>
+          <w:rFonts w:ascii="PingFang SC" w:cs="PingFang SC" w:eastAsia="PingFang SC" w:hAnsi="PingFang SC"/>
+          <w:color w:val="1C1A18"/>
+          <w:sz w:val="22"/>
+          <w:szCs w:val="22"/>
+        </w:rPr>
+        <w:t xml:space="preserve">：实例是节点，断言是边，每条边带支持等级。回答"已经验证出了什么"。它只在事实升格后才有内容。挣得多少，画多少。</w:t>
+      </w:r>
+    </w:p>
+    <w:p>
+      <w:pPr>
+        <w:spacing w:after="160" w:line="340"/>
+      </w:pPr>
+      <w:r>
+        <w:rPr>
+          <w:rFonts w:ascii="PingFang SC" w:cs="PingFang SC" w:eastAsia="PingFang SC" w:hAnsi="PingFang SC"/>
+          <w:color w:val="1C1A18"/>
+          <w:sz w:val="22"/>
+          <w:szCs w:val="22"/>
+        </w:rPr>
+        <w:t xml:space="preserve">两张图都是纯函数投影——从事件流算出来的。改不了，也不用同步。</w:t>
+      </w:r>
+    </w:p>
+    <w:p>
+      <w:pPr>
+        <w:spacing w:after="80" w:before="200"/>
+        <w:jc w:val="center"/>
+      </w:pPr>
+      <w:r>
+        <w:drawing>
+          <wp:inline distT="0" distB="0" distL="0" distR="0">
+            <wp:extent cx="660" cy="520"/>
+            <wp:effectExtent t="0" r="0" b="0" l="0"/>
+            <wp:docPr id="1" name="docs/shots/zh/facts.png" descr="docs/shots/zh/facts.png" title="docs/shots/zh/facts.png"/>
+            <wp:cNvGraphicFramePr>
+              <a:graphicFrameLocks xmlns:a="http://schemas.openxmlformats.org/drawingml/2006/main" noChangeAspect="1"/>
+            </wp:cNvGraphicFramePr>
+            <a:graphic xmlns:a="http://schemas.openxmlformats.org/drawingml/2006/main">
+              <a:graphicData uri="http://schemas.openxmlformats.org/drawingml/2006/picture">
+                <pic:pic xmlns:pic="http://schemas.openxmlformats.org/drawingml/2006/picture">
+                  <pic:nvPicPr>
+                    <pic:cNvPr id="0" name="" descr=""/>
+                    <pic:cNvPicPr>
+                      <a:picLocks noChangeAspect="1" noChangeArrowheads="1"/>
+                    </pic:cNvPicPr>
+                  </pic:nvPicPr>
+                  <pic:blipFill>
+                    <a:blip r:embed="rId11" cstate="none"/>
+                    <a:srcRect/>
+                    <a:stretch>
+                      <a:fillRect/>
+                    </a:stretch>
+                  </pic:blipFill>
+                  <pic:spPr bwMode="auto">
+                    <a:xfrm>
+                      <a:off x="0" y="0"/>
+                      <a:ext cx="660" cy="520"/>
+                    </a:xfrm>
+                    <a:prstGeom prst="rect">
+                      <a:avLst/>
+                    </a:prstGeom>
+                  </pic:spPr>
+                </pic:pic>
+              </a:graphicData>
+            </a:graphic>
+          </wp:inline>
+        </w:drawing>
+      </w:r>
+    </w:p>
+    <w:p>
+      <w:pPr>
+        <w:spacing w:after="240"/>
+        <w:jc w:val="center"/>
+      </w:pPr>
+      <w:r>
+        <w:rPr>
+          <w:rFonts w:ascii="PingFang SC" w:cs="PingFang SC" w:eastAsia="PingFang SC" w:hAnsi="PingFang SC"/>
+          <w:color w:val="6B6862"/>
+          <w:sz w:val="20"/>
+          <w:szCs w:val="20"/>
+        </w:rPr>
+        <w:t xml:space="preserve">本体格：图带（本体图|实体图切换）+ 本体货架（已确立条目，每条带断言芯片与冲突标记）+ 命题</w:t>
+      </w:r>
+    </w:p>
+    <w:p>
+      <w:pPr>
+        <w:spacing w:after="80" w:before="200"/>
+        <w:jc w:val="center"/>
+      </w:pPr>
+      <w:r>
+        <w:drawing>
+          <wp:inline distT="0" distB="0" distL="0" distR="0">
+            <wp:extent cx="880" cy="495"/>
+            <wp:effectExtent t="0" r="0" b="0" l="0"/>
+            <wp:docPr id="1" name="docs/diagrams/epistemic-loop-hero.zh-CN.png" descr="docs/diagrams/epistemic-loop-hero.zh-CN.png" title="docs/diagrams/epistemic-loop-hero.zh-CN.png"/>
+            <wp:cNvGraphicFramePr>
+              <a:graphicFrameLocks xmlns:a="http://schemas.openxmlformats.org/drawingml/2006/main" noChangeAspect="1"/>
+            </wp:cNvGraphicFramePr>
+            <a:graphic xmlns:a="http://schemas.openxmlformats.org/drawingml/2006/main">
+              <a:graphicData uri="http://schemas.openxmlformats.org/drawingml/2006/picture">
+                <pic:pic xmlns:pic="http://schemas.openxmlformats.org/drawingml/2006/picture">
+                  <pic:nvPicPr>
+                    <pic:cNvPr id="0" name="" descr=""/>
+                    <pic:cNvPicPr>
+                      <a:picLocks noChangeAspect="1" noChangeArrowheads="1"/>
+                    </pic:cNvPicPr>
+                  </pic:nvPicPr>
+                  <pic:blipFill>
+                    <a:blip r:embed="rId12" cstate="none"/>
+                    <a:srcRect/>
+                    <a:stretch>
+                      <a:fillRect/>
+                    </a:stretch>
+                  </pic:blipFill>
+                  <pic:spPr bwMode="auto">
+                    <a:xfrm>
+                      <a:off x="0" y="0"/>
                       <a:ext cx="880" cy="495"/>
                     </a:xfrm>
                     <a:prstGeom prst="rect">
@@ -2043,6 +2150,67 @@
     </w:p>
     <w:p>
       <w:pPr>
+        <w:spacing w:after="80" w:before="200"/>
+        <w:jc w:val="center"/>
+      </w:pPr>
+      <w:r>
+        <w:drawing>
+          <wp:inline distT="0" distB="0" distL="0" distR="0">
+            <wp:extent cx="620" cy="633"/>
+            <wp:effectExtent t="0" r="0" b="0" l="0"/>
+            <wp:docPr id="1" name="docs/shots/zh/worldlines.png" descr="docs/shots/zh/worldlines.png" title="docs/shots/zh/worldlines.png"/>
+            <wp:cNvGraphicFramePr>
+              <a:graphicFrameLocks xmlns:a="http://schemas.openxmlformats.org/drawingml/2006/main" noChangeAspect="1"/>
+            </wp:cNvGraphicFramePr>
+            <a:graphic xmlns:a="http://schemas.openxmlformats.org/drawingml/2006/main">
+              <a:graphicData uri="http://schemas.openxmlformats.org/drawingml/2006/picture">
+                <pic:pic xmlns:pic="http://schemas.openxmlformats.org/drawingml/2006/picture">
+                  <pic:nvPicPr>
+                    <pic:cNvPr id="0" name="" descr=""/>
+                    <pic:cNvPicPr>
+                      <a:picLocks noChangeAspect="1" noChangeArrowheads="1"/>
+                    </pic:cNvPicPr>
+                  </pic:nvPicPr>
+                  <pic:blipFill>
+                    <a:blip r:embed="rId13" cstate="none"/>
+                    <a:srcRect/>
+                    <a:stretch>
+                      <a:fillRect/>
+                    </a:stretch>
+                  </pic:blipFill>
+                  <pic:spPr bwMode="auto">
+                    <a:xfrm>
+                      <a:off x="0" y="0"/>
+                      <a:ext cx="620" cy="633"/>
+                    </a:xfrm>
+                    <a:prstGeom prst="rect">
+                      <a:avLst/>
+                    </a:prstGeom>
+                  </pic:spPr>
+                </pic:pic>
+              </a:graphicData>
+            </a:graphic>
+          </wp:inline>
+        </w:drawing>
+      </w:r>
+    </w:p>
+    <w:p>
+      <w:pPr>
+        <w:spacing w:after="240"/>
+        <w:jc w:val="center"/>
+      </w:pPr>
+      <w:r>
+        <w:rPr>
+          <w:rFonts w:ascii="PingFang SC" w:cs="PingFang SC" w:eastAsia="PingFang SC" w:hAnsi="PingFang SC"/>
+          <w:color w:val="6B6862"/>
+          <w:sz w:val="20"/>
+          <w:szCs w:val="20"/>
+        </w:rPr>
+        <w:t xml:space="preserve">世界树：计划的拓扑与闸门——脊柱步、叉开的车道、收敛点、要你拍板的那一下</w:t>
+      </w:r>
+    </w:p>
+    <w:p>
+      <w:pPr>
         <w:spacing w:after="160" w:line="340"/>
       </w:pPr>
       <w:r>
@@ -2848,6 +3016,67 @@
         <w:spacing w:after="160"/>
         <w:ind w:left="360" w:right="360"/>
       </w:pPr>
+    </w:p>
+    <w:p>
+      <w:pPr>
+        <w:spacing w:after="80" w:before="200"/>
+        <w:jc w:val="center"/>
+      </w:pPr>
+      <w:r>
+        <w:drawing>
+          <wp:inline distT="0" distB="0" distL="0" distR="0">
+            <wp:extent cx="800" cy="533"/>
+            <wp:effectExtent t="0" r="0" b="0" l="0"/>
+            <wp:docPr id="1" name="docs/diagrams/loop-to-dsh-planes.zh-CN.png" descr="docs/diagrams/loop-to-dsh-planes.zh-CN.png" title="docs/diagrams/loop-to-dsh-planes.zh-CN.png"/>
+            <wp:cNvGraphicFramePr>
+              <a:graphicFrameLocks xmlns:a="http://schemas.openxmlformats.org/drawingml/2006/main" noChangeAspect="1"/>
+            </wp:cNvGraphicFramePr>
+            <a:graphic xmlns:a="http://schemas.openxmlformats.org/drawingml/2006/main">
+              <a:graphicData uri="http://schemas.openxmlformats.org/drawingml/2006/picture">
+                <pic:pic xmlns:pic="http://schemas.openxmlformats.org/drawingml/2006/picture">
+                  <pic:nvPicPr>
+                    <pic:cNvPr id="0" name="" descr=""/>
+                    <pic:cNvPicPr>
+                      <a:picLocks noChangeAspect="1" noChangeArrowheads="1"/>
+                    </pic:cNvPicPr>
+                  </pic:nvPicPr>
+                  <pic:blipFill>
+                    <a:blip r:embed="rId14" cstate="none"/>
+                    <a:srcRect/>
+                    <a:stretch>
+                      <a:fillRect/>
+                    </a:stretch>
+                  </pic:blipFill>
+                  <pic:spPr bwMode="auto">
+                    <a:xfrm>
+                      <a:off x="0" y="0"/>
+                      <a:ext cx="800" cy="533"/>
+                    </a:xfrm>
+                    <a:prstGeom prst="rect">
+                      <a:avLst/>
+                    </a:prstGeom>
+                  </pic:spPr>
+                </pic:pic>
+              </a:graphicData>
+            </a:graphic>
+          </wp:inline>
+        </w:drawing>
+      </w:r>
+    </w:p>
+    <w:p>
+      <w:pPr>
+        <w:spacing w:after="240"/>
+        <w:jc w:val="center"/>
+      </w:pPr>
+      <w:r>
+        <w:rPr>
+          <w:rFonts w:ascii="PingFang SC" w:cs="PingFang SC" w:eastAsia="PingFang SC" w:hAnsi="PingFang SC"/>
+          <w:color w:val="6B6862"/>
+          <w:sz w:val="20"/>
+          <w:szCs w:val="20"/>
+        </w:rPr>
+        <w:t xml:space="preserve">ClearAI 在 DSH 中的位置：认识论层加在组合面上——宿主包 + agent 预设 + 客户端模块</w:t>
+      </w:r>
     </w:p>
     <w:p>
       <w:pPr>
@@ -4342,6 +4571,67 @@
           <w:szCs w:val="22"/>
         </w:rPr>
         <w:t xml:space="preserve"/>
+      </w:r>
+    </w:p>
+    <w:p>
+      <w:pPr>
+        <w:spacing w:after="80" w:before="200"/>
+        <w:jc w:val="center"/>
+      </w:pPr>
+      <w:r>
+        <w:drawing>
+          <wp:inline distT="0" distB="0" distL="0" distR="0">
+            <wp:extent cx="660" cy="520"/>
+            <wp:effectExtent t="0" r="0" b="0" l="0"/>
+            <wp:docPr id="1" name="docs/shots/zh/deliverables.png" descr="docs/shots/zh/deliverables.png" title="docs/shots/zh/deliverables.png"/>
+            <wp:cNvGraphicFramePr>
+              <a:graphicFrameLocks xmlns:a="http://schemas.openxmlformats.org/drawingml/2006/main" noChangeAspect="1"/>
+            </wp:cNvGraphicFramePr>
+            <a:graphic xmlns:a="http://schemas.openxmlformats.org/drawingml/2006/main">
+              <a:graphicData uri="http://schemas.openxmlformats.org/drawingml/2006/picture">
+                <pic:pic xmlns:pic="http://schemas.openxmlformats.org/drawingml/2006/picture">
+                  <pic:nvPicPr>
+                    <pic:cNvPr id="0" name="" descr=""/>
+                    <pic:cNvPicPr>
+                      <a:picLocks noChangeAspect="1" noChangeArrowheads="1"/>
+                    </pic:cNvPicPr>
+                  </pic:nvPicPr>
+                  <pic:blipFill>
+                    <a:blip r:embed="rId15" cstate="none"/>
+                    <a:srcRect/>
+                    <a:stretch>
+                      <a:fillRect/>
+                    </a:stretch>
+                  </pic:blipFill>
+                  <pic:spPr bwMode="auto">
+                    <a:xfrm>
+                      <a:off x="0" y="0"/>
+                      <a:ext cx="660" cy="520"/>
+                    </a:xfrm>
+                    <a:prstGeom prst="rect">
+                      <a:avLst/>
+                    </a:prstGeom>
+                  </pic:spPr>
+                </pic:pic>
+              </a:graphicData>
+            </a:graphic>
+          </wp:inline>
+        </w:drawing>
+      </w:r>
+    </w:p>
+    <w:p>
+      <w:pPr>
+        <w:spacing w:after="240"/>
+        <w:jc w:val="center"/>
+      </w:pPr>
+      <w:r>
+        <w:rPr>
+          <w:rFonts w:ascii="PingFang SC" w:cs="PingFang SC" w:eastAsia="PingFang SC" w:hAnsi="PingFang SC"/>
+          <w:color w:val="6B6862"/>
+          <w:sz w:val="20"/>
+          <w:szCs w:val="20"/>
+        </w:rPr>
+        <w:t xml:space="preserve">产物格：计划的声明交付与盘上真有的分开摆——按阶段排开，每步带判据</w:t>
       </w:r>
     </w:p>
     <w:p>

</xml_diff>